<commit_message>
feat: enhance query handling and configuration updates; add provider support in models and UI
</commit_message>
<xml_diff>
--- a/doc/ODNQ_conformité.docx
+++ b/doc/ODNQ_conformité.docx
@@ -9,170 +9,516 @@
       <w:r>
         <w:t xml:space="preserve">Présentation de l’application </w:t>
       </w:r>
-      <w:r>
-        <w:rPr>
-          <w:i/>
-          <w:iCs/>
-        </w:rPr>
-        <w:t>Ben – Nutritionniste</w:t>
-      </w:r>
-    </w:p>
-    <w:p>
-      <w:r>
-        <w:t xml:space="preserve">L’application « Ben – Nutritionniste » </w:t>
-      </w:r>
-      <w:r>
-        <w:t xml:space="preserve">est un assistant en ligne basé sur une IA entraînée par un vrai nutritionniste, accessible via le web </w:t>
-      </w:r>
-      <w:r>
-        <w:t>ou sur téléphone mobile (voir lien</w:t>
-      </w:r>
-      <w:r>
-        <w:t>s</w:t>
-      </w:r>
-      <w:hyperlink r:id="rId7" w:history="1"/>
-      <w:r>
-        <w:t xml:space="preserve"> ci-dessous</w:t>
-      </w:r>
-      <w:r>
-        <w:t>)</w:t>
-      </w:r>
-      <w:r>
-        <w:t xml:space="preserve">. L’objectif </w:t>
-      </w:r>
-      <w:r>
-        <w:t xml:space="preserve">de cette application </w:t>
-      </w:r>
-      <w:r>
-        <w:t>est de permettre aux utilisateurs d’obtenir des conseils généraux en nutrition, santé et performance à travers une interface de chat</w:t>
-      </w:r>
-      <w:r>
-        <w:t xml:space="preserve">, similaire à </w:t>
-      </w:r>
       <w:proofErr w:type="spellStart"/>
       <w:r>
-        <w:t>ChatGPT</w:t>
+        <w:rPr>
+          <w:i/>
+          <w:iCs/>
+        </w:rPr>
+        <w:t>NutriFAQ</w:t>
       </w:r>
       <w:proofErr w:type="spellEnd"/>
       <w:r>
+        <w:rPr>
+          <w:i/>
+          <w:iCs/>
+        </w:rPr>
+        <w:t>-Chat</w:t>
+      </w:r>
+    </w:p>
+    <w:p>
+      <w:proofErr w:type="spellStart"/>
+      <w:r>
+        <w:rPr>
+          <w:i/>
+          <w:iCs/>
+        </w:rPr>
+        <w:t>NutriFAQ</w:t>
+      </w:r>
+      <w:proofErr w:type="spellEnd"/>
+      <w:r>
+        <w:rPr>
+          <w:i/>
+          <w:iCs/>
+        </w:rPr>
+        <w:t>-Chat</w:t>
+      </w:r>
+      <w:r>
+        <w:t xml:space="preserve"> </w:t>
+      </w:r>
+      <w:r>
+        <w:t>est une plateforme d’intelligence artificielle conversationnelle développée par IMX permettant d’interroger une base de connaissances en langage naturel. Basée sur une architecture de type RAG (</w:t>
+      </w:r>
+      <w:proofErr w:type="spellStart"/>
+      <w:r>
+        <w:rPr>
+          <w:i/>
+          <w:iCs/>
+        </w:rPr>
+        <w:t>Retrieval</w:t>
+      </w:r>
+      <w:proofErr w:type="spellEnd"/>
+      <w:r>
+        <w:rPr>
+          <w:i/>
+          <w:iCs/>
+        </w:rPr>
+        <w:t xml:space="preserve"> </w:t>
+      </w:r>
+      <w:proofErr w:type="spellStart"/>
+      <w:r>
+        <w:rPr>
+          <w:i/>
+          <w:iCs/>
+        </w:rPr>
+        <w:t>Augmented</w:t>
+      </w:r>
+      <w:proofErr w:type="spellEnd"/>
+      <w:r>
+        <w:rPr>
+          <w:i/>
+          <w:iCs/>
+        </w:rPr>
+        <w:t xml:space="preserve"> </w:t>
+      </w:r>
+      <w:proofErr w:type="spellStart"/>
+      <w:r>
+        <w:rPr>
+          <w:i/>
+          <w:iCs/>
+        </w:rPr>
+        <w:t>Generation</w:t>
+      </w:r>
+      <w:proofErr w:type="spellEnd"/>
+      <w:r>
+        <w:t>), elle génère des réponses à partir de documents validés tout en fournissant les références pertinentes.</w:t>
+      </w:r>
+    </w:p>
+    <w:p>
+      <w:proofErr w:type="spellStart"/>
+      <w:r>
+        <w:t>NutriFAQ</w:t>
+      </w:r>
+      <w:proofErr w:type="spellEnd"/>
+      <w:r>
+        <w:t xml:space="preserve"> est une plateforme d’information destinée au grand public qui vise à rendre accessibles des informations fiables et validées en nutrition.</w:t>
+      </w:r>
+    </w:p>
+    <w:p>
+      <w:r>
+        <w:t xml:space="preserve">L’application « </w:t>
+      </w:r>
+      <w:proofErr w:type="spellStart"/>
+      <w:r>
+        <w:rPr>
+          <w:i/>
+          <w:iCs/>
+        </w:rPr>
+        <w:t>NutriFAQ</w:t>
+      </w:r>
+      <w:proofErr w:type="spellEnd"/>
+      <w:r>
+        <w:rPr>
+          <w:i/>
+          <w:iCs/>
+        </w:rPr>
+        <w:t>-</w:t>
+      </w:r>
+      <w:proofErr w:type="gramStart"/>
+      <w:r>
+        <w:rPr>
+          <w:i/>
+          <w:iCs/>
+        </w:rPr>
+        <w:t>Chat</w:t>
+      </w:r>
+      <w:r>
+        <w:t>»</w:t>
+      </w:r>
+      <w:proofErr w:type="gramEnd"/>
+      <w:r>
+        <w:t xml:space="preserve"> est une application web utilisant une intelligence artificielle à des fins strictement informationnelles et éducatives. Elle ne constitue pas une prestation de services professionnels en nutrition au sens de la Loi sur les diététistes.</w:t>
+      </w:r>
+    </w:p>
+    <w:p>
+      <w:r>
+        <w:t>L’application ne réalise aucune évaluation nutritionnelle, ne pose aucun diagnostic, ne prescrit aucun plan de traitement et n’offre aucun suivi individualisé. Elle comporte des avertissements explicites indiquant qu’elle ne remplace pas une consultation avec une ou un diététiste-nutritionniste membre de l’Ordre.</w:t>
+      </w:r>
+    </w:p>
+    <w:p>
+      <w:r>
+        <w:t>Des mécanismes de sécurité sont intégrés afin d’empêcher la fourniture de conseils cliniques personnalisés et afin de rediriger l’utilisateur vers un professionnel de la santé lorsque la situation l’exige.</w:t>
+      </w:r>
+    </w:p>
+    <w:p>
+      <w:r>
+        <w:t>L’utilisation de technologies d’intelligence artificielle est encadrée par des principes de prudence, de transparence et de protection du public, conformément aux obligations déontologiques des diététistes-nutritionnistes, notamment en matière de secret professionnel, de publicité honnête et de responsabilité professionnelle.</w:t>
+      </w:r>
+    </w:p>
+    <w:p>
+      <w:pPr>
+        <w:pStyle w:val="En-tte1"/>
+      </w:pPr>
+      <w:r>
+        <w:t>Réponses aux questions potentielles de l’ODNQ</w:t>
+      </w:r>
+    </w:p>
+    <w:p>
+      <w:r>
+        <w:t>Cette section</w:t>
+      </w:r>
+      <w:r>
+        <w:t xml:space="preserve"> </w:t>
+      </w:r>
+      <w:r>
+        <w:t xml:space="preserve">tente de répondre aux questions que </w:t>
+      </w:r>
+      <w:r>
+        <w:t>l’Ordre des nutritionnistes du Québec (ODNQ)</w:t>
+      </w:r>
+      <w:r>
+        <w:t xml:space="preserve"> pourrait s</w:t>
+      </w:r>
+      <w:r>
+        <w:t xml:space="preserve">e poser concernant ton application IA, en s’appuyant directement sur les principes du Code de déontologie </w:t>
+      </w:r>
+      <w:r>
+        <w:t xml:space="preserve">de l’ordre </w:t>
+      </w:r>
+      <w:r>
+        <w:t>et sur les obligations professionnelles usuelles.</w:t>
+      </w:r>
+    </w:p>
+    <w:p>
+      <w:pPr>
+        <w:pStyle w:val="Titre3"/>
+      </w:pPr>
+      <w:r>
+        <w:t>Nature du service rendu</w:t>
+      </w:r>
+    </w:p>
+    <w:p>
+      <w:r>
+        <w:t>Q : L’application exerce-t-elle la profession de diététiste-nutritionniste?</w:t>
+      </w:r>
+    </w:p>
+    <w:p>
+      <w:r>
+        <w:lastRenderedPageBreak/>
+        <w:t>R :</w:t>
+      </w:r>
+      <w:r>
+        <w:t xml:space="preserve"> </w:t>
+      </w:r>
+      <w:r>
+        <w:t>Non. L’application ne fournit pas de services professionnels en nutrition. Elle diffuse de l’information générale à caractère éducatif, sans évaluation nutritionnelle, sans diagnostic, sans plan de traitement et sans suivi clinique individualisé.</w:t>
+      </w:r>
+    </w:p>
+    <w:p>
+      <w:r>
+        <w:t>Q : Les réponses sont-elles personnalisées?</w:t>
+      </w:r>
+    </w:p>
+    <w:p>
+      <w:r>
+        <w:t>R :</w:t>
+      </w:r>
+      <w:r>
+        <w:t xml:space="preserve">  </w:t>
+      </w:r>
+      <w:r>
+        <w:t>Non. Les réponses sont adaptées au contexte général des questions posées, mais ne constituent pas des recommandations personnalisées fondées sur une évaluation nutritionnelle au sens professionnel.</w:t>
+      </w:r>
+    </w:p>
+    <w:p>
+      <w:pPr>
+        <w:pStyle w:val="Titre3"/>
+      </w:pPr>
+      <w:r>
+        <w:t>Responsabilité professionnelle</w:t>
+      </w:r>
+    </w:p>
+    <w:p>
+      <w:r>
+        <w:t>Q : Qui est responsable du contenu généré par l’IA?</w:t>
+      </w:r>
+    </w:p>
+    <w:p>
+      <w:r>
+        <w:rPr>
+          <w:highlight w:val="yellow"/>
+        </w:rPr>
+        <w:t>R : Les concepteurs de l’application assument la responsabilité du cadre d’utilisation de l’outil. Le système inclut des limites, des avertissements explicites et des mécanismes visant à prévenir les usages à risque.</w:t>
+      </w:r>
+    </w:p>
+    <w:p>
+      <w:r>
+        <w:t>Q : Un nutritionniste supervise-t-il l’outil?</w:t>
+      </w:r>
+    </w:p>
+    <w:p>
+      <w:r>
+        <w:t>R :</w:t>
+      </w:r>
+      <w:r>
+        <w:t xml:space="preserve"> </w:t>
+      </w:r>
+      <w:r>
+        <w:t>Le contenu de référence et les balises sont définis à partir de sources reconnues et de principes validés en nutrition, mais l’outil ne se substitue jamais au jugement professionnel d’un nutritionniste.</w:t>
+      </w:r>
+    </w:p>
+    <w:p>
+      <w:pPr>
+        <w:pStyle w:val="Titre3"/>
+      </w:pPr>
+      <w:r>
+        <w:t>Transparence et avertissements</w:t>
+      </w:r>
+    </w:p>
+    <w:p>
+      <w:r>
+        <w:t>Q : L’utilisateur est-il clairement informé?</w:t>
+      </w:r>
+    </w:p>
+    <w:p>
+      <w:r>
+        <w:t>R :</w:t>
+      </w:r>
+      <w:r>
+        <w:t xml:space="preserve"> </w:t>
+      </w:r>
+      <w:r>
+        <w:t>Oui. L’application indique clairement :</w:t>
+      </w:r>
+    </w:p>
+    <w:p>
+      <w:pPr>
+        <w:pStyle w:val="Paragraphedeliste"/>
+        <w:numPr>
+          <w:ilvl w:val="0"/>
+          <w:numId w:val="10"/>
+        </w:numPr>
+      </w:pPr>
+      <w:proofErr w:type="gramStart"/>
+      <w:r>
+        <w:t>qu’il</w:t>
+      </w:r>
+      <w:proofErr w:type="gramEnd"/>
+      <w:r>
+        <w:t xml:space="preserve"> s’agit d’une intelligence artificielle,</w:t>
+      </w:r>
+    </w:p>
+    <w:p>
+      <w:pPr>
+        <w:pStyle w:val="Paragraphedeliste"/>
+        <w:numPr>
+          <w:ilvl w:val="0"/>
+          <w:numId w:val="10"/>
+        </w:numPr>
+      </w:pPr>
+      <w:proofErr w:type="gramStart"/>
+      <w:r>
+        <w:t>que</w:t>
+      </w:r>
+      <w:proofErr w:type="gramEnd"/>
+      <w:r>
+        <w:t xml:space="preserve"> l’information fournie ne remplace pas une consultation,</w:t>
+      </w:r>
+    </w:p>
+    <w:p>
+      <w:pPr>
+        <w:pStyle w:val="Paragraphedeliste"/>
+        <w:numPr>
+          <w:ilvl w:val="0"/>
+          <w:numId w:val="10"/>
+        </w:numPr>
+      </w:pPr>
+      <w:proofErr w:type="gramStart"/>
+      <w:r>
+        <w:t>que</w:t>
+      </w:r>
+      <w:proofErr w:type="gramEnd"/>
+      <w:r>
+        <w:t xml:space="preserve"> l’utilisateur doit consulter un professionnel pour toute situation clinique.</w:t>
+      </w:r>
+    </w:p>
+    <w:p>
+      <w:pPr>
+        <w:pStyle w:val="Titre3"/>
+      </w:pPr>
+      <w:r>
+        <w:t>Données de santé et personnalisation</w:t>
+      </w:r>
+    </w:p>
+    <w:p>
+      <w:r>
+        <w:t>Q : L’IA collecte-t-elle des données de santé?</w:t>
+      </w:r>
+    </w:p>
+    <w:p>
+      <w:r>
+        <w:lastRenderedPageBreak/>
+        <w:t>R :</w:t>
+      </w:r>
+      <w:r>
+        <w:t xml:space="preserve"> </w:t>
+      </w:r>
+      <w:r>
+        <w:t>L’application n’exige aucune information médicale identifiable. Les questions sont posées volontairement par l’utilisateur, sans incitation à divulguer des données sensibles.</w:t>
+      </w:r>
+    </w:p>
+    <w:p>
+      <w:r>
+        <w:t>Q : Y a-t-il un risque d’acte réservé?</w:t>
+      </w:r>
+    </w:p>
+    <w:p>
+      <w:r>
+        <w:t>R :</w:t>
+      </w:r>
+      <w:r>
+        <w:t xml:space="preserve"> </w:t>
+      </w:r>
+      <w:r>
+        <w:t>Non. L’IA est explicitement programmée pour refuser toute demande impliquant :</w:t>
+      </w:r>
+    </w:p>
+    <w:p>
+      <w:pPr>
+        <w:pStyle w:val="Paragraphedeliste"/>
+        <w:numPr>
+          <w:ilvl w:val="0"/>
+          <w:numId w:val="11"/>
+        </w:numPr>
+      </w:pPr>
+      <w:proofErr w:type="gramStart"/>
+      <w:r>
+        <w:t>diagnostic</w:t>
+      </w:r>
+      <w:proofErr w:type="gramEnd"/>
+      <w:r>
+        <w:t>,</w:t>
+      </w:r>
+    </w:p>
+    <w:p>
+      <w:pPr>
+        <w:pStyle w:val="Paragraphedeliste"/>
+        <w:numPr>
+          <w:ilvl w:val="0"/>
+          <w:numId w:val="11"/>
+        </w:numPr>
+      </w:pPr>
+      <w:proofErr w:type="gramStart"/>
+      <w:r>
+        <w:t>traitement</w:t>
+      </w:r>
+      <w:proofErr w:type="gramEnd"/>
+      <w:r>
+        <w:t xml:space="preserve"> nutritionnel individualisé,</w:t>
+      </w:r>
+    </w:p>
+    <w:p>
+      <w:pPr>
+        <w:pStyle w:val="Paragraphedeliste"/>
+        <w:numPr>
+          <w:ilvl w:val="0"/>
+          <w:numId w:val="11"/>
+        </w:numPr>
+      </w:pPr>
+      <w:proofErr w:type="gramStart"/>
+      <w:r>
+        <w:t>recommandations</w:t>
+      </w:r>
+      <w:proofErr w:type="gramEnd"/>
+      <w:r>
+        <w:t xml:space="preserve"> cliniques personnalisées.</w:t>
+      </w:r>
+    </w:p>
+    <w:p>
+      <w:pPr>
+        <w:pStyle w:val="Titre3"/>
+      </w:pPr>
+      <w:r>
+        <w:t>Confidentialité et secret professionnel</w:t>
+      </w:r>
+    </w:p>
+    <w:p>
+      <w:r>
+        <w:t>Q : Les données sont-elles partagées avec des tiers?</w:t>
+      </w:r>
+    </w:p>
+    <w:p>
+      <w:r>
+        <w:t>R :</w:t>
+      </w:r>
+      <w:r>
+        <w:t xml:space="preserve"> </w:t>
+      </w:r>
+      <w:r>
+        <w:t>Les données textuelles sont traitées par un fournisseur d’IA via API</w:t>
+      </w:r>
+      <w:r>
+        <w:t xml:space="preserve"> d’</w:t>
+      </w:r>
+      <w:proofErr w:type="spellStart"/>
+      <w:r>
+        <w:t>OpenAI</w:t>
+      </w:r>
+      <w:proofErr w:type="spellEnd"/>
+      <w:r>
+        <w:t xml:space="preserve"> (ou autre modèle)</w:t>
+      </w:r>
+      <w:r>
+        <w:t>, sans être utilisées à des fins d’entraînement. Elles ne sont pas revendues ni exploitées à des fins commerciales</w:t>
+      </w:r>
+      <w:r>
         <w:t>.</w:t>
       </w:r>
+    </w:p>
+    <w:p>
+      <w:r>
+        <w:t>Q : Où sont les données hébergées?</w:t>
+      </w:r>
+    </w:p>
+    <w:p>
+      <w:r>
+        <w:t>R :</w:t>
+      </w:r>
       <w:r>
         <w:t xml:space="preserve"> </w:t>
       </w:r>
-    </w:p>
-    <w:p>
-      <w:r>
-        <w:t xml:space="preserve">L’application a été développé par la compagnie IMX Technologie, une firme spécialisé en intelligence artificielle. </w:t>
-      </w:r>
-    </w:p>
-    <w:p>
-      <w:r>
-        <w:t>L’assistant</w:t>
+      <w:r>
+        <w:t xml:space="preserve">L’infrastructure de l’application repose sur des centres de données sécurisés </w:t>
+      </w:r>
+      <w:r>
+        <w:t>d’Azure de Microsoft</w:t>
+      </w:r>
+      <w:r>
+        <w:t>. Les données sont protégées par des mécanismes de chiffrement en transit et au repos, et l’architecture respecte les bonnes pratiques reconnues en matière de sécurité de l’information et de protection des renseignements personnels.</w:t>
+      </w:r>
+    </w:p>
+    <w:p>
+      <w:pPr>
+        <w:pStyle w:val="Titre3"/>
+      </w:pPr>
+      <w:r>
+        <w:t>Utilisation responsable de l’IA</w:t>
+      </w:r>
+    </w:p>
+    <w:p>
+      <w:r>
+        <w:t>Q : Que se passe-t-il si une question est à risque?</w:t>
+      </w:r>
+    </w:p>
+    <w:p>
+      <w:r>
+        <w:t>R :</w:t>
       </w:r>
       <w:r>
         <w:t xml:space="preserve"> </w:t>
       </w:r>
       <w:r>
-        <w:t>a été entrainé à répondre à partir d’</w:t>
-      </w:r>
-      <w:r>
-        <w:t xml:space="preserve">un corpus de connaissance développé par Benoit Boulanger </w:t>
-      </w:r>
-      <w:proofErr w:type="spellStart"/>
-      <w:proofErr w:type="gramStart"/>
-      <w:r>
-        <w:t>Dt.P</w:t>
-      </w:r>
-      <w:proofErr w:type="spellEnd"/>
-      <w:proofErr w:type="gramEnd"/>
-      <w:r>
-        <w:t xml:space="preserve">, </w:t>
-      </w:r>
-      <w:proofErr w:type="spellStart"/>
-      <w:proofErr w:type="gramStart"/>
-      <w:r>
-        <w:t>M.Sc</w:t>
-      </w:r>
-      <w:proofErr w:type="spellEnd"/>
-      <w:proofErr w:type="gramEnd"/>
-      <w:r>
-        <w:t xml:space="preserve">, présentement candidat au Doctorat en comportement alimentaire à l’université Laval. Les informations utilisé par l’assistant sont celles transcrites des vidéo d’informations publiées par Benoit Boulanger sur son compte </w:t>
-      </w:r>
-      <w:r>
-        <w:t>Instagram</w:t>
-      </w:r>
-      <w:r>
-        <w:t xml:space="preserve"> et ses podcast</w:t>
-      </w:r>
-      <w:r>
-        <w:t xml:space="preserve"> (voir liens ci-dessous)</w:t>
-      </w:r>
-      <w:r>
-        <w:t>.</w:t>
-      </w:r>
-    </w:p>
-    <w:p>
-      <w:r>
-        <w:t>L’application « Ben – Nutritionniste » est une application web utilisant une intelligence artificielle à des fins strictement informationnelles et éducatives. Elle ne constitue pas une prestation de services professionnels en nutrition au sens de la Loi sur les diététistes.</w:t>
-      </w:r>
-    </w:p>
-    <w:p>
-      <w:r>
-        <w:t>L’application ne réalise aucune évaluation nutritionnelle, ne pose aucun diagnostic, ne prescrit aucun plan de traitement et n’offre aucun suivi individualisé. Elle comporte des avertissements explicites indiquant qu’elle ne remplace pas une consultation avec une ou un diététiste-nutritionniste membre de l’Ordre.</w:t>
-      </w:r>
-    </w:p>
-    <w:p>
-      <w:r>
-        <w:t>Des mécanismes de sécurité sont intégrés afin d’empêcher la fourniture de conseils cliniques personnalisés et afin de rediriger l’utilisateur vers un professionnel de la santé lorsque la situation l’exige.</w:t>
-      </w:r>
-    </w:p>
-    <w:p>
-      <w:r>
-        <w:t>L’utilisation de technologies d’intelligence artificielle est encadrée par des principes de prudence, de transparence et de protection du public, conformément aux obligations déontologiques des diététistes-nutritionnistes, notamment en matière de secret professionnel, de publicité honnête et de responsabilité professionnelle.</w:t>
-      </w:r>
-    </w:p>
-    <w:p>
-      <w:r>
-        <w:t>Pour l’instant, n</w:t>
-      </w:r>
-      <w:r>
-        <w:t>ous avons volontairement restreint l’accès public durant la période d’évaluation afin d’éviter toute utilisation inappropriée.</w:t>
-      </w:r>
-    </w:p>
-    <w:p>
-      <w:pPr>
-        <w:pStyle w:val="En-tte1"/>
-      </w:pPr>
-      <w:r>
-        <w:lastRenderedPageBreak/>
-        <w:t>Réponses aux questions potentielles de l’ODNQ</w:t>
-      </w:r>
-    </w:p>
-    <w:p>
-      <w:r>
-        <w:t>Cette section</w:t>
-      </w:r>
-      <w:r>
-        <w:t xml:space="preserve"> </w:t>
-      </w:r>
-      <w:r>
-        <w:t xml:space="preserve">tente de répondre aux questions que </w:t>
-      </w:r>
-      <w:r>
-        <w:t>l’Ordre des nutritionnistes du Québec (ODNQ)</w:t>
-      </w:r>
-      <w:r>
-        <w:t xml:space="preserve"> pourrait s</w:t>
-      </w:r>
-      <w:r>
-        <w:t xml:space="preserve">e poser concernant ton application IA, en s’appuyant directement sur les principes du Code de déontologie </w:t>
-      </w:r>
-      <w:r>
-        <w:t xml:space="preserve">de l’ordre </w:t>
-      </w:r>
-      <w:r>
-        <w:t>et sur les obligations professionnelles usuelles.</w:t>
+        <w:t>L’IA redirige systématiquement l’utilisateur vers un professionnel de la santé lorsque la question dépasse le cadre informationnel sécuritaire.</w:t>
       </w:r>
     </w:p>
     <w:p>
@@ -184,12 +530,12 @@
         </w:numPr>
       </w:pPr>
       <w:r>
-        <w:t>Nature du service rendu</w:t>
-      </w:r>
-    </w:p>
-    <w:p>
-      <w:r>
-        <w:t>Q : L’application exerce-t-elle la profession de diététiste-nutritionniste?</w:t>
+        <w:t>Assurance responsabilité professionnelle</w:t>
+      </w:r>
+    </w:p>
+    <w:p>
+      <w:r>
+        <w:t>Q : Avez-vous une assurance couvrant l’outil?</w:t>
       </w:r>
     </w:p>
     <w:p>
@@ -200,23 +546,7 @@
         <w:t xml:space="preserve"> </w:t>
       </w:r>
       <w:r>
-        <w:t>Non. L’application ne fournit pas de services professionnels en nutrition. Elle diffuse de l’information générale à caractère éducatif, sans évaluation nutritionnelle, sans diagnostic, sans plan de traitement et sans suivi clinique individualisé.</w:t>
-      </w:r>
-    </w:p>
-    <w:p>
-      <w:r>
-        <w:t>Q : Les réponses sont-elles personnalisées?</w:t>
-      </w:r>
-    </w:p>
-    <w:p>
-      <w:r>
-        <w:t>R :</w:t>
-      </w:r>
-      <w:r>
-        <w:t xml:space="preserve">  </w:t>
-      </w:r>
-      <w:r>
-        <w:t>Non. Les réponses sont adaptées au contexte général des questions posées, mais ne constituent pas des recommandations personnalisées fondées sur une évaluation nutritionnelle au sens professionnel.</w:t>
+        <w:t>L’entreprise IMX technologie a une assurances erreur et omission de 2M$.</w:t>
       </w:r>
     </w:p>
     <w:p>
@@ -228,12 +558,13 @@
         </w:numPr>
       </w:pPr>
       <w:r>
-        <w:t>Responsabilité professionnelle</w:t>
-      </w:r>
-    </w:p>
-    <w:p>
-      <w:r>
-        <w:t>Q : Qui est responsable du contenu généré par l’IA?</w:t>
+        <w:t>Publicité et usage du titre</w:t>
+      </w:r>
+    </w:p>
+    <w:p>
+      <w:r>
+        <w:lastRenderedPageBreak/>
+        <w:t>Q : Utilisez-vous le titre de nutritionniste?</w:t>
       </w:r>
     </w:p>
     <w:p>
@@ -244,41 +575,7 @@
         <w:t xml:space="preserve"> </w:t>
       </w:r>
       <w:r>
-        <w:t>Le</w:t>
-      </w:r>
-      <w:r>
-        <w:t>s</w:t>
-      </w:r>
-      <w:r>
-        <w:t xml:space="preserve"> concepteur</w:t>
-      </w:r>
-      <w:r>
-        <w:t>s</w:t>
-      </w:r>
-      <w:r>
-        <w:t xml:space="preserve"> de l’application assume</w:t>
-      </w:r>
-      <w:r>
-        <w:t>nt</w:t>
-      </w:r>
-      <w:r>
-        <w:t xml:space="preserve"> la responsabilité du cadre d’utilisation de l’outil. Le système inclut des limites, des avertissements explicites et des mécanismes visant à prévenir les usages à risque.</w:t>
-      </w:r>
-    </w:p>
-    <w:p>
-      <w:r>
-        <w:t>Q : Un nutritionniste supervise-t-il l’outil?</w:t>
-      </w:r>
-    </w:p>
-    <w:p>
-      <w:r>
-        <w:t>R :</w:t>
-      </w:r>
-      <w:r>
-        <w:t xml:space="preserve"> </w:t>
-      </w:r>
-      <w:r>
-        <w:t>Le contenu de référence et les balises sont définis à partir de sources reconnues et de principes validés en nutrition, mais l’outil ne se substitue jamais au jugement professionnel d’un nutritionniste.</w:t>
+        <w:t>Le terme est utilisé uniquement à des fins descriptives et éducatives. Aucune représentation ne laisse croire à un service professionnel ou à une approbation par l’ODNQ.</w:t>
       </w:r>
     </w:p>
     <w:p>
@@ -290,12 +587,12 @@
         </w:numPr>
       </w:pPr>
       <w:r>
-        <w:t>Transparence et avertissements</w:t>
-      </w:r>
-    </w:p>
-    <w:p>
-      <w:r>
-        <w:t>Q : L’utilisateur est-il clairement informé?</w:t>
+        <w:t>Plaintes et incidents</w:t>
+      </w:r>
+    </w:p>
+    <w:p>
+      <w:r>
+        <w:t>Q : Existe-t-il un mécanisme de plainte?</w:t>
       </w:r>
     </w:p>
     <w:p>
@@ -306,343 +603,6 @@
         <w:t xml:space="preserve"> </w:t>
       </w:r>
       <w:r>
-        <w:t>Oui. L’application indique clairement :</w:t>
-      </w:r>
-    </w:p>
-    <w:p>
-      <w:pPr>
-        <w:pStyle w:val="Paragraphedeliste"/>
-        <w:numPr>
-          <w:ilvl w:val="0"/>
-          <w:numId w:val="10"/>
-        </w:numPr>
-      </w:pPr>
-      <w:proofErr w:type="gramStart"/>
-      <w:r>
-        <w:lastRenderedPageBreak/>
-        <w:t>qu’il</w:t>
-      </w:r>
-      <w:proofErr w:type="gramEnd"/>
-      <w:r>
-        <w:t xml:space="preserve"> s’agit d’une intelligence artificielle,</w:t>
-      </w:r>
-    </w:p>
-    <w:p>
-      <w:pPr>
-        <w:pStyle w:val="Paragraphedeliste"/>
-        <w:numPr>
-          <w:ilvl w:val="0"/>
-          <w:numId w:val="10"/>
-        </w:numPr>
-      </w:pPr>
-      <w:proofErr w:type="gramStart"/>
-      <w:r>
-        <w:t>que</w:t>
-      </w:r>
-      <w:proofErr w:type="gramEnd"/>
-      <w:r>
-        <w:t xml:space="preserve"> l’information fournie ne remplace pas une consultation,</w:t>
-      </w:r>
-    </w:p>
-    <w:p>
-      <w:pPr>
-        <w:pStyle w:val="Paragraphedeliste"/>
-        <w:numPr>
-          <w:ilvl w:val="0"/>
-          <w:numId w:val="10"/>
-        </w:numPr>
-      </w:pPr>
-      <w:proofErr w:type="gramStart"/>
-      <w:r>
-        <w:t>que</w:t>
-      </w:r>
-      <w:proofErr w:type="gramEnd"/>
-      <w:r>
-        <w:t xml:space="preserve"> l’utilisateur doit consulter un professionnel pour toute situation clinique.</w:t>
-      </w:r>
-    </w:p>
-    <w:p>
-      <w:pPr>
-        <w:pStyle w:val="Paragraphedeliste"/>
-        <w:numPr>
-          <w:ilvl w:val="0"/>
-          <w:numId w:val="9"/>
-        </w:numPr>
-      </w:pPr>
-      <w:r>
-        <w:t>Données de santé et personnalisation</w:t>
-      </w:r>
-    </w:p>
-    <w:p>
-      <w:r>
-        <w:t>Q : L’IA collecte-t-elle des données de santé?</w:t>
-      </w:r>
-    </w:p>
-    <w:p>
-      <w:r>
-        <w:t>R :</w:t>
-      </w:r>
-      <w:r>
-        <w:t xml:space="preserve"> </w:t>
-      </w:r>
-      <w:r>
-        <w:t>L’application n’exige aucune information médicale identifiable. Les questions sont posées volontairement par l’utilisateur, sans incitation à divulguer des données sensibles.</w:t>
-      </w:r>
-    </w:p>
-    <w:p>
-      <w:r>
-        <w:t>Q : Y a-t-il un risque d’acte réservé?</w:t>
-      </w:r>
-    </w:p>
-    <w:p>
-      <w:r>
-        <w:t>R :</w:t>
-      </w:r>
-      <w:r>
-        <w:t xml:space="preserve"> </w:t>
-      </w:r>
-      <w:r>
-        <w:t>Non. L’IA est explicitement programmée pour refuser toute demande impliquant :</w:t>
-      </w:r>
-    </w:p>
-    <w:p>
-      <w:pPr>
-        <w:pStyle w:val="Paragraphedeliste"/>
-        <w:numPr>
-          <w:ilvl w:val="0"/>
-          <w:numId w:val="11"/>
-        </w:numPr>
-      </w:pPr>
-      <w:proofErr w:type="gramStart"/>
-      <w:r>
-        <w:t>diagnostic</w:t>
-      </w:r>
-      <w:proofErr w:type="gramEnd"/>
-      <w:r>
-        <w:t>,</w:t>
-      </w:r>
-    </w:p>
-    <w:p>
-      <w:pPr>
-        <w:pStyle w:val="Paragraphedeliste"/>
-        <w:numPr>
-          <w:ilvl w:val="0"/>
-          <w:numId w:val="11"/>
-        </w:numPr>
-      </w:pPr>
-      <w:proofErr w:type="gramStart"/>
-      <w:r>
-        <w:t>traitement</w:t>
-      </w:r>
-      <w:proofErr w:type="gramEnd"/>
-      <w:r>
-        <w:t xml:space="preserve"> nutritionnel individualisé,</w:t>
-      </w:r>
-    </w:p>
-    <w:p>
-      <w:pPr>
-        <w:pStyle w:val="Paragraphedeliste"/>
-        <w:numPr>
-          <w:ilvl w:val="0"/>
-          <w:numId w:val="11"/>
-        </w:numPr>
-      </w:pPr>
-      <w:proofErr w:type="gramStart"/>
-      <w:r>
-        <w:t>recommandations</w:t>
-      </w:r>
-      <w:proofErr w:type="gramEnd"/>
-      <w:r>
-        <w:t xml:space="preserve"> cliniques personnalisées.</w:t>
-      </w:r>
-    </w:p>
-    <w:p>
-      <w:pPr>
-        <w:pStyle w:val="Paragraphedeliste"/>
-        <w:numPr>
-          <w:ilvl w:val="0"/>
-          <w:numId w:val="9"/>
-        </w:numPr>
-      </w:pPr>
-      <w:r>
-        <w:t>Confidentialité et secret professionnel</w:t>
-      </w:r>
-    </w:p>
-    <w:p>
-      <w:r>
-        <w:t>Q : Les données sont-elles partagées avec des tiers?</w:t>
-      </w:r>
-    </w:p>
-    <w:p>
-      <w:r>
-        <w:t>R :</w:t>
-      </w:r>
-      <w:r>
-        <w:t xml:space="preserve"> </w:t>
-      </w:r>
-      <w:r>
-        <w:t>Les données textuelles sont traitées par un fournisseur d’IA via API</w:t>
-      </w:r>
-      <w:r>
-        <w:t xml:space="preserve"> d’</w:t>
-      </w:r>
-      <w:proofErr w:type="spellStart"/>
-      <w:r>
-        <w:t>OpenAI</w:t>
-      </w:r>
-      <w:proofErr w:type="spellEnd"/>
-      <w:r>
-        <w:t>, sans être utilisées à des fins d’entraînement. Elles ne sont pas revendues ni exploitées à des fins commerciales</w:t>
-      </w:r>
-      <w:r>
-        <w:t xml:space="preserve"> (voir règles d’</w:t>
-      </w:r>
-      <w:proofErr w:type="spellStart"/>
-      <w:r>
-        <w:t>OpenAI</w:t>
-      </w:r>
-      <w:proofErr w:type="spellEnd"/>
-      <w:r>
-        <w:t xml:space="preserve"> : </w:t>
-      </w:r>
-      <w:hyperlink r:id="rId8" w:history="1">
-        <w:r>
-          <w:rPr>
-            <w:rStyle w:val="Hyperlien"/>
-          </w:rPr>
-          <w:t>https://platform.openai.com/docs/guides/your-data</w:t>
-        </w:r>
-      </w:hyperlink>
-      <w:r>
-        <w:t>)</w:t>
-      </w:r>
-    </w:p>
-    <w:p>
-      <w:r>
-        <w:t>Q : Où sont les données hébergées?</w:t>
-      </w:r>
-    </w:p>
-    <w:p>
-      <w:r>
-        <w:t>R :</w:t>
-      </w:r>
-      <w:r>
-        <w:t xml:space="preserve"> </w:t>
-      </w:r>
-      <w:r>
-        <w:t>L’infrastructure de l’application repose sur des centres de données sécurisés de Google Cloud. Les données sont protégées par des mécanismes de chiffrement en transit et au repos, et l’architecture respecte les bonnes pratiques reconnues en matière de sécurité de l’information et de protection des renseignements personnels.</w:t>
-      </w:r>
-    </w:p>
-    <w:p>
-      <w:pPr>
-        <w:pStyle w:val="Paragraphedeliste"/>
-        <w:numPr>
-          <w:ilvl w:val="0"/>
-          <w:numId w:val="9"/>
-        </w:numPr>
-      </w:pPr>
-      <w:r>
-        <w:t>Utilisation responsable de l’IA</w:t>
-      </w:r>
-    </w:p>
-    <w:p>
-      <w:r>
-        <w:t>Q : Que se passe-t-il si une question est à risque?</w:t>
-      </w:r>
-    </w:p>
-    <w:p>
-      <w:r>
-        <w:t>R :</w:t>
-      </w:r>
-      <w:r>
-        <w:t xml:space="preserve"> </w:t>
-      </w:r>
-      <w:r>
-        <w:t>L’IA redirige systématiquement l’utilisateur vers un professionnel de la santé lorsque la question dépasse le cadre informationnel sécuritaire.</w:t>
-      </w:r>
-    </w:p>
-    <w:p>
-      <w:pPr>
-        <w:pStyle w:val="Paragraphedeliste"/>
-        <w:numPr>
-          <w:ilvl w:val="0"/>
-          <w:numId w:val="9"/>
-        </w:numPr>
-      </w:pPr>
-      <w:r>
-        <w:lastRenderedPageBreak/>
-        <w:t>Assurance responsabilité professionnelle</w:t>
-      </w:r>
-    </w:p>
-    <w:p>
-      <w:r>
-        <w:t>Q : Avez-vous une assurance couvrant l’outil?</w:t>
-      </w:r>
-    </w:p>
-    <w:p>
-      <w:r>
-        <w:t>R :</w:t>
-      </w:r>
-      <w:r>
-        <w:t xml:space="preserve"> </w:t>
-      </w:r>
-      <w:r>
-        <w:t>L’entreprise IMX technologie a une assurances erreur et omission de 2M$.</w:t>
-      </w:r>
-    </w:p>
-    <w:p>
-      <w:pPr>
-        <w:pStyle w:val="Paragraphedeliste"/>
-        <w:numPr>
-          <w:ilvl w:val="0"/>
-          <w:numId w:val="9"/>
-        </w:numPr>
-      </w:pPr>
-      <w:r>
-        <w:t>Publicité et usage du titre</w:t>
-      </w:r>
-    </w:p>
-    <w:p>
-      <w:r>
-        <w:t>Q : Utilisez-vous le titre de nutritionniste?</w:t>
-      </w:r>
-    </w:p>
-    <w:p>
-      <w:r>
-        <w:t>R :</w:t>
-      </w:r>
-      <w:r>
-        <w:t xml:space="preserve"> </w:t>
-      </w:r>
-      <w:r>
-        <w:t>Le terme est utilisé uniquement à des fins descriptives et éducatives. Aucune représentation ne laisse croire à un service professionnel ou à une approbation par l’ODNQ.</w:t>
-      </w:r>
-    </w:p>
-    <w:p>
-      <w:pPr>
-        <w:pStyle w:val="Paragraphedeliste"/>
-        <w:numPr>
-          <w:ilvl w:val="0"/>
-          <w:numId w:val="9"/>
-        </w:numPr>
-      </w:pPr>
-      <w:r>
-        <w:t>Plaintes et incidents</w:t>
-      </w:r>
-    </w:p>
-    <w:p>
-      <w:r>
-        <w:t>Q : Existe-t-il un mécanisme de plainte?</w:t>
-      </w:r>
-    </w:p>
-    <w:p>
-      <w:r>
-        <w:t>R :</w:t>
-      </w:r>
-      <w:r>
-        <w:t xml:space="preserve"> </w:t>
-      </w:r>
-      <w:r>
         <w:t>Oui. Un mécanisme de contact est prévu et les incidents peuvent être documentés et analysés afin d’améliorer la sécurité de l’outil.</w:t>
       </w:r>
     </w:p>
@@ -681,21 +641,7 @@
           <w:i/>
           <w:iCs/>
         </w:rPr>
-        <w:t>Tu es « Ben », un assistant virtuel basé sur une intelligence artificielle,</w:t>
-      </w:r>
-      <w:r>
-        <w:rPr>
-          <w:i/>
-          <w:iCs/>
-        </w:rPr>
-        <w:t xml:space="preserve"> </w:t>
-      </w:r>
-      <w:r>
-        <w:rPr>
-          <w:i/>
-          <w:iCs/>
-        </w:rPr>
-        <w:t>spécialisé dans la diffusion d’informations générales et éducatives en nutrition.</w:t>
+        <w:t>Tu es « Ben », un assistant virtuel basé sur une intelligence artificielle, spécialisé dans la diffusion d’informations générales et éducatives en nutrition.</w:t>
       </w:r>
     </w:p>
     <w:p>
@@ -785,7 +731,6 @@
           <w:i/>
           <w:iCs/>
         </w:rPr>
-        <w:lastRenderedPageBreak/>
         <w:t># STYLE DE COMMUNICATION (FRANÇAIS)</w:t>
       </w:r>
     </w:p>
@@ -881,6 +826,7 @@
           <w:i/>
           <w:iCs/>
         </w:rPr>
+        <w:lastRenderedPageBreak/>
         <w:t>Reconnaît les limites des connaissances scientifiques</w:t>
       </w:r>
     </w:p>
@@ -1051,14 +997,7 @@
           <w:i/>
           <w:iCs/>
         </w:rPr>
-        <w:t>CONTEXTE DISPONIBLE (INFORMATION GÉNÉRALE UNIQUEMENT) :</w:t>
-      </w:r>
-      <w:r>
-        <w:rPr>
-          <w:i/>
-          <w:iCs/>
-        </w:rPr>
-        <w:t xml:space="preserve"> </w:t>
+        <w:t xml:space="preserve">CONTEXTE DISPONIBLE (INFORMATION GÉNÉRALE UNIQUEMENT) : </w:t>
       </w:r>
     </w:p>
     <w:p>
@@ -1379,7 +1318,6 @@
           <w:i/>
           <w:iCs/>
         </w:rPr>
-        <w:lastRenderedPageBreak/>
         <w:t>redirige</w:t>
       </w:r>
       <w:proofErr w:type="gramEnd"/>
@@ -1483,6 +1421,7 @@
           <w:i/>
           <w:iCs/>
         </w:rPr>
+        <w:lastRenderedPageBreak/>
         <w:t xml:space="preserve">- L’historique est utilisé uniquement pour cohérence </w:t>
       </w:r>
       <w:proofErr w:type="gramStart"/>
@@ -1544,10 +1483,10 @@
           <w:numId w:val="7"/>
         </w:numPr>
       </w:pPr>
-      <w:hyperlink r:id="rId9" w:history="1">
+      <w:hyperlink r:id="rId7" w:history="1">
         <w:r>
           <w:rPr>
-            <w:rStyle w:val="Hyperlien"/>
+            <w:rStyle w:val="Lienhypertexte"/>
           </w:rPr>
           <w:t>https://chat.bennutritionniste.com/</w:t>
         </w:r>
@@ -1564,10 +1503,10 @@
       <w:r>
         <w:t xml:space="preserve">Version débloquée : </w:t>
       </w:r>
-      <w:hyperlink r:id="rId10" w:history="1">
+      <w:hyperlink r:id="rId8" w:history="1">
         <w:r>
           <w:rPr>
-            <w:rStyle w:val="Hyperlien"/>
+            <w:rStyle w:val="Lienhypertexte"/>
           </w:rPr>
           <w:t>https://chat.bennutritionniste.com/?code=demo4836&amp;lang=fr</w:t>
         </w:r>
@@ -1604,10 +1543,10 @@
       <w:r>
         <w:t xml:space="preserve"> : </w:t>
       </w:r>
-      <w:hyperlink r:id="rId11" w:history="1">
+      <w:hyperlink r:id="rId9" w:history="1">
         <w:r>
           <w:rPr>
-            <w:rStyle w:val="Hyperlien"/>
+            <w:rStyle w:val="Lienhypertexte"/>
           </w:rPr>
           <w:t>https://bennutritionniste.com/</w:t>
         </w:r>
@@ -1636,10 +1575,10 @@
       <w:r>
         <w:t xml:space="preserve">: </w:t>
       </w:r>
-      <w:hyperlink r:id="rId12" w:history="1">
+      <w:hyperlink r:id="rId10" w:history="1">
         <w:r>
           <w:rPr>
-            <w:rStyle w:val="Hyperlien"/>
+            <w:rStyle w:val="Lienhypertexte"/>
           </w:rPr>
           <w:t>https://www.instagram.com/ben.nutritionniste/</w:t>
         </w:r>
@@ -1668,10 +1607,10 @@
       <w:r>
         <w:t xml:space="preserve"> : </w:t>
       </w:r>
-      <w:hyperlink r:id="rId13" w:history="1">
+      <w:hyperlink r:id="rId11" w:history="1">
         <w:r>
           <w:rPr>
-            <w:rStyle w:val="Hyperlien"/>
+            <w:rStyle w:val="Lienhypertexte"/>
           </w:rPr>
           <w:t>https://linktr.ee/ben.nutritionniste</w:t>
         </w:r>
@@ -1864,7 +1803,7 @@
                     <pic:cNvPicPr/>
                   </pic:nvPicPr>
                   <pic:blipFill>
-                    <a:blip r:embed="rId14"/>
+                    <a:blip r:embed="rId12"/>
                     <a:stretch>
                       <a:fillRect/>
                     </a:stretch>
@@ -1972,6 +1911,9 @@
         <w:t xml:space="preserve"> </w:t>
       </w:r>
       <w:r>
+        <w:rPr>
+          <w:noProof/>
+        </w:rPr>
         <w:drawing>
           <wp:inline distT="0" distB="0" distL="0" distR="0" wp14:anchorId="0104CC93" wp14:editId="765E2B5C">
             <wp:extent cx="3979469" cy="3618936"/>
@@ -1988,7 +1930,7 @@
                     <pic:cNvPicPr/>
                   </pic:nvPicPr>
                   <pic:blipFill>
-                    <a:blip r:embed="rId15"/>
+                    <a:blip r:embed="rId13"/>
                     <a:stretch>
                       <a:fillRect/>
                     </a:stretch>
@@ -2034,7 +1976,7 @@
                     <pic:cNvPicPr/>
                   </pic:nvPicPr>
                   <pic:blipFill>
-                    <a:blip r:embed="rId16"/>
+                    <a:blip r:embed="rId14"/>
                     <a:stretch>
                       <a:fillRect/>
                     </a:stretch>
@@ -2079,7 +2021,7 @@
                     <pic:cNvPicPr/>
                   </pic:nvPicPr>
                   <pic:blipFill>
-                    <a:blip r:embed="rId17"/>
+                    <a:blip r:embed="rId15"/>
                     <a:stretch>
                       <a:fillRect/>
                     </a:stretch>
@@ -2125,7 +2067,7 @@
                     <pic:cNvPicPr/>
                   </pic:nvPicPr>
                   <pic:blipFill>
-                    <a:blip r:embed="rId18"/>
+                    <a:blip r:embed="rId16"/>
                     <a:stretch>
                       <a:fillRect/>
                     </a:stretch>
@@ -2147,7 +2089,7 @@
       </w:r>
     </w:p>
     <w:sectPr>
-      <w:footerReference w:type="default" r:id="rId19"/>
+      <w:footerReference w:type="default" r:id="rId17"/>
       <w:pgSz w:w="12240" w:h="15840"/>
       <w:pgMar w:top="1440" w:right="1440" w:bottom="1440" w:left="1440" w:header="708" w:footer="708" w:gutter="0"/>
       <w:cols w:space="708"/>
@@ -2183,22 +2125,14 @@
       <w:pStyle w:val="Pieddepage"/>
     </w:pPr>
     <w:r>
-      <w:t>Ben-</w:t>
-    </w:r>
-    <w:r>
-      <w:t>N</w:t>
-    </w:r>
-    <w:r>
-      <w:t>utritionniste</w:t>
+      <w:t>Copyright IMX Technologie 2026</w:t>
     </w:r>
     <w:r>
       <w:ptab w:relativeTo="margin" w:alignment="center" w:leader="none"/>
     </w:r>
-    <w:proofErr w:type="spellStart"/>
     <w:r>
       <w:t>Confidentiel</w:t>
     </w:r>
-    <w:proofErr w:type="spellEnd"/>
     <w:r>
       <w:ptab w:relativeTo="margin" w:alignment="right" w:leader="none"/>
     </w:r>
@@ -4608,7 +4542,6 @@
     <w:next w:val="Normal"/>
     <w:link w:val="Titre3Car"/>
     <w:uiPriority w:val="9"/>
-    <w:semiHidden/>
     <w:unhideWhenUsed/>
     <w:qFormat/>
     <w:rsid w:val="00223CD2"/>
@@ -4760,6 +4693,7 @@
   <w:style w:type="character" w:default="1" w:styleId="Policepardfaut">
     <w:name w:val="Default Paragraph Font"/>
     <w:uiPriority w:val="1"/>
+    <w:semiHidden/>
     <w:unhideWhenUsed/>
   </w:style>
   <w:style w:type="table" w:default="1" w:styleId="TableauNormal">
@@ -4814,7 +4748,6 @@
     <w:basedOn w:val="Policepardfaut"/>
     <w:link w:val="Titre3"/>
     <w:uiPriority w:val="9"/>
-    <w:semiHidden/>
     <w:rsid w:val="00223CD2"/>
     <w:rPr>
       <w:rFonts w:asciiTheme="minorHAnsi" w:eastAsiaTheme="majorEastAsia" w:hAnsiTheme="minorHAnsi" w:cstheme="majorBidi"/>
@@ -5072,7 +5005,7 @@
       <w:spacing w:val="5"/>
     </w:rPr>
   </w:style>
-  <w:style w:type="character" w:styleId="Hyperlien">
+  <w:style w:type="character" w:styleId="Lienhypertexte">
     <w:name w:val="Hyperlink"/>
     <w:basedOn w:val="Policepardfaut"/>
     <w:uiPriority w:val="99"/>

</xml_diff>

<commit_message>
Mise à jour de la documentation
</commit_message>
<xml_diff>
--- a/doc/ODNQ_conformité.docx
+++ b/doc/ODNQ_conformité.docx
@@ -9,25 +9,30 @@
       <w:r>
         <w:t xml:space="preserve">Présentation de l’application </w:t>
       </w:r>
-      <w:proofErr w:type="spellStart"/>
       <w:r>
         <w:rPr>
           <w:i/>
           <w:iCs/>
         </w:rPr>
-        <w:t>NutriFAQ</w:t>
-      </w:r>
-      <w:proofErr w:type="spellEnd"/>
+        <w:t>NutriFAQ-Chat</w:t>
+      </w:r>
+    </w:p>
+    <w:p>
       <w:r>
         <w:rPr>
           <w:i/>
           <w:iCs/>
         </w:rPr>
-        <w:t>-Chat</w:t>
-      </w:r>
-    </w:p>
-    <w:p>
-      <w:proofErr w:type="spellStart"/>
+        <w:t>NutriFAQ-Chat</w:t>
+      </w:r>
+      <w:r>
+        <w:t xml:space="preserve"> est une plateforme d’intelligence artificielle conversationnelle développée par IMX, permettant d’interroger une base de connaissances en langage naturel. Basée sur une architecture de type RAG (Retrieval-Augmented Generation), elle génère des réponses à partir de documents validés tout en fournissant les références pertinentes.</w:t>
+      </w:r>
+    </w:p>
+    <w:p>
+      <w:r>
+        <w:t xml:space="preserve">Les informations utilisées par l’application sont extraites du site Web </w:t>
+      </w:r>
       <w:r>
         <w:rPr>
           <w:i/>
@@ -35,158 +40,208 @@
         </w:rPr>
         <w:t>NutriFAQ</w:t>
       </w:r>
-      <w:proofErr w:type="spellEnd"/>
+      <w:r>
+        <w:t xml:space="preserve">, destiné au grand public et visant à rendre accessibles des informations fiables et validées en nutrition. Ce site a été développé par l’équipe du professeur Benoît Lamarche, directeur du </w:t>
+      </w:r>
       <w:r>
         <w:rPr>
           <w:i/>
           <w:iCs/>
         </w:rPr>
-        <w:t>-Chat</w:t>
-      </w:r>
-      <w:r>
-        <w:t xml:space="preserve"> </w:t>
-      </w:r>
-      <w:r>
-        <w:t>est une plateforme d’intelligence artificielle conversationnelle développée par IMX permettant d’interroger une base de connaissances en langage naturel. Basée sur une architecture de type RAG (</w:t>
-      </w:r>
-      <w:proofErr w:type="spellStart"/>
+        <w:t>Centre NUTRISS</w:t>
+      </w:r>
+      <w:r>
+        <w:t xml:space="preserve"> de l’Université Laval.</w:t>
+      </w:r>
+    </w:p>
+    <w:p>
+      <w:r>
+        <w:t xml:space="preserve">L’application </w:t>
+      </w:r>
       <w:r>
         <w:rPr>
           <w:i/>
           <w:iCs/>
         </w:rPr>
-        <w:t>Retrieval</w:t>
-      </w:r>
-      <w:proofErr w:type="spellEnd"/>
+        <w:t>NutriFAQ-Chat</w:t>
+      </w:r>
+      <w:r>
+        <w:t xml:space="preserve"> est une application Web qui sera éventuellement intégrée au site Web </w:t>
+      </w:r>
       <w:r>
         <w:rPr>
           <w:i/>
           <w:iCs/>
         </w:rPr>
+        <w:t>NutriFAQ</w:t>
+      </w:r>
+      <w:r>
+        <w:t>. Elle utilise l’intelligence artificielle à des fins strictement informationnelles et éducatives. Elle ne constitue pas une prestation de services professionnels en nutrition au sens de la Loi sur les diététistes.</w:t>
+      </w:r>
+    </w:p>
+    <w:p>
+      <w:r>
+        <w:t>L’application ne réalise aucune évaluation nutritionnelle, ne pose aucun diagnostic, ne prescrit aucun plan de traitement et n’offre aucun suivi individualisé. Elle devra comporter des avertissements explicites indiquant qu’elle ne remplace pas une consultation avec une ou un diététiste-nutritionniste membre de l’Ordre.</w:t>
+      </w:r>
+    </w:p>
+    <w:p>
+      <w:r>
+        <w:t>Des mécanismes de sécurité sont intégrés afin d’empêcher la fourniture de conseils cliniques personnalisés et de rediriger l’utilisateur vers un professionnel de la santé lorsque la situation l’exige.</w:t>
+      </w:r>
+    </w:p>
+    <w:p>
+      <w:r>
+        <w:t>L’utilisation des technologies d’intelligence artificielle est encadrée par des principes de prudence, de transparence et de protection du public, conformément aux obligations déontologiques applicables aux diététistes-nutritionnistes, notamment en matière de secret professionnel, de publicité honnête et de responsabilité professionnelle.</w:t>
+      </w:r>
+    </w:p>
+    <w:p>
+      <w:pPr>
+        <w:spacing w:line="480" w:lineRule="auto"/>
+        <w:rPr>
+          <w:b/>
+          <w:bCs/>
+          <w:sz w:val="28"/>
+          <w:szCs w:val="28"/>
+        </w:rPr>
+      </w:pPr>
+      <w:r>
+        <w:br w:type="page"/>
+      </w:r>
+    </w:p>
+    <w:p>
+      <w:pPr>
+        <w:pStyle w:val="En-tte1"/>
+      </w:pPr>
+      <w:r>
+        <w:lastRenderedPageBreak/>
+        <w:t>Réponses aux questions potentielles de l’ODNQ</w:t>
+      </w:r>
+    </w:p>
+    <w:p>
+      <w:r>
+        <w:t>Cette section</w:t>
+      </w:r>
+      <w:r>
         <w:t xml:space="preserve"> </w:t>
       </w:r>
-      <w:proofErr w:type="spellStart"/>
-      <w:r>
-        <w:rPr>
-          <w:i/>
-          <w:iCs/>
-        </w:rPr>
-        <w:t>Augmented</w:t>
-      </w:r>
-      <w:proofErr w:type="spellEnd"/>
-      <w:r>
-        <w:rPr>
-          <w:i/>
-          <w:iCs/>
-        </w:rPr>
+      <w:r>
+        <w:t xml:space="preserve">tente de répondre aux questions que </w:t>
+      </w:r>
+      <w:r>
+        <w:t>l’Ordre des nutritionnistes du Québec (ODNQ)</w:t>
+      </w:r>
+      <w:r>
+        <w:t xml:space="preserve"> pourrait s</w:t>
+      </w:r>
+      <w:r>
+        <w:t xml:space="preserve">e poser concernant ton application IA, en s’appuyant directement sur les principes du Code de déontologie </w:t>
+      </w:r>
+      <w:r>
+        <w:t xml:space="preserve">de l’ordre </w:t>
+      </w:r>
+      <w:r>
+        <w:t>et sur les obligations professionnelles usuelles.</w:t>
+      </w:r>
+    </w:p>
+    <w:p>
+      <w:pPr>
+        <w:pStyle w:val="Titre3"/>
+      </w:pPr>
+      <w:r>
+        <w:t>Nature du service rendu</w:t>
+      </w:r>
+    </w:p>
+    <w:p>
+      <w:r>
+        <w:t>Q : L’application exerce-t-elle la profession de diététiste-nutritionniste?</w:t>
+      </w:r>
+    </w:p>
+    <w:p>
+      <w:r>
+        <w:t>R :</w:t>
+      </w:r>
+      <w:r>
         <w:t xml:space="preserve"> </w:t>
       </w:r>
-      <w:proofErr w:type="spellStart"/>
-      <w:r>
-        <w:rPr>
-          <w:i/>
-          <w:iCs/>
-        </w:rPr>
-        <w:t>Generation</w:t>
-      </w:r>
-      <w:proofErr w:type="spellEnd"/>
-      <w:r>
-        <w:t>), elle génère des réponses à partir de documents validés tout en fournissant les références pertinentes.</w:t>
-      </w:r>
-    </w:p>
-    <w:p>
-      <w:proofErr w:type="spellStart"/>
-      <w:r>
-        <w:t>NutriFAQ</w:t>
-      </w:r>
-      <w:proofErr w:type="spellEnd"/>
-      <w:r>
-        <w:t xml:space="preserve"> est une plateforme d’information destinée au grand public qui vise à rendre accessibles des informations fiables et validées en nutrition.</w:t>
-      </w:r>
-    </w:p>
-    <w:p>
-      <w:r>
-        <w:t xml:space="preserve">L’application « </w:t>
-      </w:r>
-      <w:proofErr w:type="spellStart"/>
-      <w:r>
-        <w:rPr>
-          <w:i/>
-          <w:iCs/>
-        </w:rPr>
-        <w:t>NutriFAQ</w:t>
-      </w:r>
-      <w:proofErr w:type="spellEnd"/>
-      <w:r>
-        <w:rPr>
-          <w:i/>
-          <w:iCs/>
-        </w:rPr>
-        <w:t>-</w:t>
-      </w:r>
-      <w:proofErr w:type="gramStart"/>
-      <w:r>
-        <w:rPr>
-          <w:i/>
-          <w:iCs/>
-        </w:rPr>
-        <w:t>Chat</w:t>
-      </w:r>
-      <w:r>
-        <w:t>»</w:t>
-      </w:r>
-      <w:proofErr w:type="gramEnd"/>
-      <w:r>
-        <w:t xml:space="preserve"> est une application web utilisant une intelligence artificielle à des fins strictement informationnelles et éducatives. Elle ne constitue pas une prestation de services professionnels en nutrition au sens de la Loi sur les diététistes.</w:t>
-      </w:r>
-    </w:p>
-    <w:p>
-      <w:r>
-        <w:t>L’application ne réalise aucune évaluation nutritionnelle, ne pose aucun diagnostic, ne prescrit aucun plan de traitement et n’offre aucun suivi individualisé. Elle comporte des avertissements explicites indiquant qu’elle ne remplace pas une consultation avec une ou un diététiste-nutritionniste membre de l’Ordre.</w:t>
-      </w:r>
-    </w:p>
-    <w:p>
-      <w:r>
-        <w:t>Des mécanismes de sécurité sont intégrés afin d’empêcher la fourniture de conseils cliniques personnalisés et afin de rediriger l’utilisateur vers un professionnel de la santé lorsque la situation l’exige.</w:t>
-      </w:r>
-    </w:p>
-    <w:p>
-      <w:r>
-        <w:t>L’utilisation de technologies d’intelligence artificielle est encadrée par des principes de prudence, de transparence et de protection du public, conformément aux obligations déontologiques des diététistes-nutritionnistes, notamment en matière de secret professionnel, de publicité honnête et de responsabilité professionnelle.</w:t>
-      </w:r>
-    </w:p>
-    <w:p>
-      <w:pPr>
-        <w:pStyle w:val="En-tte1"/>
-      </w:pPr>
-      <w:r>
-        <w:t>Réponses aux questions potentielles de l’ODNQ</w:t>
-      </w:r>
-    </w:p>
-    <w:p>
-      <w:r>
-        <w:t>Cette section</w:t>
+      <w:r>
+        <w:t>Non. L’application ne fournit pas de services professionnels en nutrition. Elle diffuse de l’information générale à caractère éducatif, sans évaluation nutritionnelle, sans diagnostic, sans plan de traitement et sans suivi clinique individualisé.</w:t>
+      </w:r>
+    </w:p>
+    <w:p>
+      <w:r>
+        <w:t>Q : Les réponses sont-elles personnalisées?</w:t>
+      </w:r>
+    </w:p>
+    <w:p>
+      <w:r>
+        <w:t>R :</w:t>
+      </w:r>
+      <w:r>
+        <w:t xml:space="preserve">  </w:t>
+      </w:r>
+      <w:r>
+        <w:t>Non. Les réponses sont adaptées au contexte général des questions posées, mais ne constituent pas des recommandations personnalisées fondées sur une évaluation nutritionnelle au sens professionnel.</w:t>
+      </w:r>
+    </w:p>
+    <w:p>
+      <w:pPr>
+        <w:pStyle w:val="Titre3"/>
+      </w:pPr>
+      <w:r>
+        <w:t>Responsabilité professionnelle</w:t>
+      </w:r>
+    </w:p>
+    <w:p>
+      <w:r>
+        <w:t>Q : Qui est responsable du contenu généré par l’IA?</w:t>
+      </w:r>
+    </w:p>
+    <w:p>
+      <w:r>
+        <w:rPr>
+          <w:highlight w:val="yellow"/>
+        </w:rPr>
+        <w:t xml:space="preserve">R : </w:t>
+      </w:r>
+      <w:r>
+        <w:rPr>
+          <w:highlight w:val="yellow"/>
+        </w:rPr>
+        <w:t>L’équipe de NUTRISS (Prof. Benoit Lamarche)</w:t>
+      </w:r>
+      <w:r>
+        <w:rPr>
+          <w:highlight w:val="yellow"/>
+        </w:rPr>
+        <w:t xml:space="preserve"> assume l</w:t>
+      </w:r>
+      <w:r>
+        <w:rPr>
+          <w:highlight w:val="yellow"/>
+        </w:rPr>
+        <w:t>’entière</w:t>
+      </w:r>
+      <w:r>
+        <w:rPr>
+          <w:highlight w:val="yellow"/>
+        </w:rPr>
+        <w:t xml:space="preserve"> responsabilité du cadre d’utilisation de l’outil. Le système inclut des limites, des avertissements explicites et des mécanismes visant à prévenir les usages à risque.</w:t>
+      </w:r>
+    </w:p>
+    <w:p>
+      <w:r>
+        <w:t>Q : Un nutritionniste supervise-t-il l’outil?</w:t>
+      </w:r>
+    </w:p>
+    <w:p>
+      <w:r>
+        <w:t>R :</w:t>
       </w:r>
       <w:r>
         <w:t xml:space="preserve"> </w:t>
       </w:r>
       <w:r>
-        <w:t xml:space="preserve">tente de répondre aux questions que </w:t>
-      </w:r>
-      <w:r>
-        <w:t>l’Ordre des nutritionnistes du Québec (ODNQ)</w:t>
-      </w:r>
-      <w:r>
-        <w:t xml:space="preserve"> pourrait s</w:t>
-      </w:r>
-      <w:r>
-        <w:t xml:space="preserve">e poser concernant ton application IA, en s’appuyant directement sur les principes du Code de déontologie </w:t>
-      </w:r>
-      <w:r>
-        <w:t xml:space="preserve">de l’ordre </w:t>
-      </w:r>
-      <w:r>
-        <w:t>et sur les obligations professionnelles usuelles.</w:t>
+        <w:t>Le contenu de référence et les balises sont définis à partir de sources reconnues et de principes validés en nutrition, mais l’outil ne se substitue jamais au jugement professionnel d’un nutritionniste.</w:t>
       </w:r>
     </w:p>
     <w:p>
@@ -194,94 +249,17 @@
         <w:pStyle w:val="Titre3"/>
       </w:pPr>
       <w:r>
-        <w:t>Nature du service rendu</w:t>
-      </w:r>
-    </w:p>
-    <w:p>
-      <w:r>
-        <w:t>Q : L’application exerce-t-elle la profession de diététiste-nutritionniste?</w:t>
+        <w:t>Transparence et avertissements</w:t>
+      </w:r>
+    </w:p>
+    <w:p>
+      <w:r>
+        <w:t>Q : L’utilisateur est-il clairement informé?</w:t>
       </w:r>
     </w:p>
     <w:p>
       <w:r>
         <w:lastRenderedPageBreak/>
-        <w:t>R :</w:t>
-      </w:r>
-      <w:r>
-        <w:t xml:space="preserve"> </w:t>
-      </w:r>
-      <w:r>
-        <w:t>Non. L’application ne fournit pas de services professionnels en nutrition. Elle diffuse de l’information générale à caractère éducatif, sans évaluation nutritionnelle, sans diagnostic, sans plan de traitement et sans suivi clinique individualisé.</w:t>
-      </w:r>
-    </w:p>
-    <w:p>
-      <w:r>
-        <w:t>Q : Les réponses sont-elles personnalisées?</w:t>
-      </w:r>
-    </w:p>
-    <w:p>
-      <w:r>
-        <w:t>R :</w:t>
-      </w:r>
-      <w:r>
-        <w:t xml:space="preserve">  </w:t>
-      </w:r>
-      <w:r>
-        <w:t>Non. Les réponses sont adaptées au contexte général des questions posées, mais ne constituent pas des recommandations personnalisées fondées sur une évaluation nutritionnelle au sens professionnel.</w:t>
-      </w:r>
-    </w:p>
-    <w:p>
-      <w:pPr>
-        <w:pStyle w:val="Titre3"/>
-      </w:pPr>
-      <w:r>
-        <w:t>Responsabilité professionnelle</w:t>
-      </w:r>
-    </w:p>
-    <w:p>
-      <w:r>
-        <w:t>Q : Qui est responsable du contenu généré par l’IA?</w:t>
-      </w:r>
-    </w:p>
-    <w:p>
-      <w:r>
-        <w:rPr>
-          <w:highlight w:val="yellow"/>
-        </w:rPr>
-        <w:t>R : Les concepteurs de l’application assument la responsabilité du cadre d’utilisation de l’outil. Le système inclut des limites, des avertissements explicites et des mécanismes visant à prévenir les usages à risque.</w:t>
-      </w:r>
-    </w:p>
-    <w:p>
-      <w:r>
-        <w:t>Q : Un nutritionniste supervise-t-il l’outil?</w:t>
-      </w:r>
-    </w:p>
-    <w:p>
-      <w:r>
-        <w:t>R :</w:t>
-      </w:r>
-      <w:r>
-        <w:t xml:space="preserve"> </w:t>
-      </w:r>
-      <w:r>
-        <w:t>Le contenu de référence et les balises sont définis à partir de sources reconnues et de principes validés en nutrition, mais l’outil ne se substitue jamais au jugement professionnel d’un nutritionniste.</w:t>
-      </w:r>
-    </w:p>
-    <w:p>
-      <w:pPr>
-        <w:pStyle w:val="Titre3"/>
-      </w:pPr>
-      <w:r>
-        <w:t>Transparence et avertissements</w:t>
-      </w:r>
-    </w:p>
-    <w:p>
-      <w:r>
-        <w:t>Q : L’utilisateur est-il clairement informé?</w:t>
-      </w:r>
-    </w:p>
-    <w:p>
-      <w:r>
         <w:t>R :</w:t>
       </w:r>
       <w:r>
@@ -299,13 +277,8 @@
           <w:numId w:val="10"/>
         </w:numPr>
       </w:pPr>
-      <w:proofErr w:type="gramStart"/>
-      <w:r>
-        <w:t>qu’il</w:t>
-      </w:r>
-      <w:proofErr w:type="gramEnd"/>
-      <w:r>
-        <w:t xml:space="preserve"> s’agit d’une intelligence artificielle,</w:t>
+      <w:r>
+        <w:t>qu’il s’agit d’une intelligence artificielle,</w:t>
       </w:r>
     </w:p>
     <w:p>
@@ -316,13 +289,8 @@
           <w:numId w:val="10"/>
         </w:numPr>
       </w:pPr>
-      <w:proofErr w:type="gramStart"/>
-      <w:r>
-        <w:t>que</w:t>
-      </w:r>
-      <w:proofErr w:type="gramEnd"/>
-      <w:r>
-        <w:t xml:space="preserve"> l’information fournie ne remplace pas une consultation,</w:t>
+      <w:r>
+        <w:t>que l’information fournie ne remplace pas une consultation,</w:t>
       </w:r>
     </w:p>
     <w:p>
@@ -333,13 +301,8 @@
           <w:numId w:val="10"/>
         </w:numPr>
       </w:pPr>
-      <w:proofErr w:type="gramStart"/>
-      <w:r>
-        <w:t>que</w:t>
-      </w:r>
-      <w:proofErr w:type="gramEnd"/>
-      <w:r>
-        <w:t xml:space="preserve"> l’utilisateur doit consulter un professionnel pour toute situation clinique.</w:t>
+      <w:r>
+        <w:t>que l’utilisateur doit consulter un professionnel pour toute situation clinique.</w:t>
       </w:r>
     </w:p>
     <w:p>
@@ -357,7 +320,6 @@
     </w:p>
     <w:p>
       <w:r>
-        <w:lastRenderedPageBreak/>
         <w:t>R :</w:t>
       </w:r>
       <w:r>
@@ -391,13 +353,8 @@
           <w:numId w:val="11"/>
         </w:numPr>
       </w:pPr>
-      <w:proofErr w:type="gramStart"/>
-      <w:r>
-        <w:t>diagnostic</w:t>
-      </w:r>
-      <w:proofErr w:type="gramEnd"/>
-      <w:r>
-        <w:t>,</w:t>
+      <w:r>
+        <w:t>diagnostic,</w:t>
       </w:r>
     </w:p>
     <w:p>
@@ -408,13 +365,8 @@
           <w:numId w:val="11"/>
         </w:numPr>
       </w:pPr>
-      <w:proofErr w:type="gramStart"/>
-      <w:r>
-        <w:t>traitement</w:t>
-      </w:r>
-      <w:proofErr w:type="gramEnd"/>
-      <w:r>
-        <w:t xml:space="preserve"> nutritionnel individualisé,</w:t>
+      <w:r>
+        <w:t>traitement nutritionnel individualisé,</w:t>
       </w:r>
     </w:p>
     <w:p>
@@ -425,13 +377,8 @@
           <w:numId w:val="11"/>
         </w:numPr>
       </w:pPr>
-      <w:proofErr w:type="gramStart"/>
-      <w:r>
-        <w:t>recommandations</w:t>
-      </w:r>
-      <w:proofErr w:type="gramEnd"/>
-      <w:r>
-        <w:t xml:space="preserve"> cliniques personnalisées.</w:t>
+      <w:r>
+        <w:t>recommandations cliniques personnalisées.</w:t>
       </w:r>
     </w:p>
     <w:p>
@@ -458,13 +405,8 @@
         <w:t>Les données textuelles sont traitées par un fournisseur d’IA via API</w:t>
       </w:r>
       <w:r>
-        <w:t xml:space="preserve"> d’</w:t>
-      </w:r>
-      <w:proofErr w:type="spellStart"/>
-      <w:r>
-        <w:t>OpenAI</w:t>
-      </w:r>
-      <w:proofErr w:type="spellEnd"/>
+        <w:t xml:space="preserve"> d’OpenAI</w:t>
+      </w:r>
       <w:r>
         <w:t xml:space="preserve"> (ou autre modèle)</w:t>
       </w:r>
@@ -502,6 +444,7 @@
         <w:pStyle w:val="Titre3"/>
       </w:pPr>
       <w:r>
+        <w:lastRenderedPageBreak/>
         <w:t>Utilisation responsable de l’IA</w:t>
       </w:r>
     </w:p>
@@ -523,11 +466,7 @@
     </w:p>
     <w:p>
       <w:pPr>
-        <w:pStyle w:val="Paragraphedeliste"/>
-        <w:numPr>
-          <w:ilvl w:val="0"/>
-          <w:numId w:val="9"/>
-        </w:numPr>
+        <w:pStyle w:val="Titre3"/>
       </w:pPr>
       <w:r>
         <w:t>Assurance responsabilité professionnelle</w:t>
@@ -540,1083 +479,102 @@
     </w:p>
     <w:p>
       <w:r>
+        <w:rPr>
+          <w:highlight w:val="yellow"/>
+        </w:rPr>
+        <w:t xml:space="preserve">R : </w:t>
+      </w:r>
+      <w:r>
+        <w:rPr>
+          <w:highlight w:val="yellow"/>
+        </w:rPr>
+        <w:t>Voir avec Prof. Benoit Lamarche</w:t>
+      </w:r>
+      <w:r>
+        <w:rPr>
+          <w:highlight w:val="yellow"/>
+        </w:rPr>
+        <w:t>.</w:t>
+      </w:r>
+    </w:p>
+    <w:p>
+      <w:pPr>
+        <w:pStyle w:val="Titre3"/>
+      </w:pPr>
+      <w:r>
+        <w:t>Publicité et usage du titre</w:t>
+      </w:r>
+    </w:p>
+    <w:p>
+      <w:r>
+        <w:t>Q : Utilisez-vous le titre de nutritionniste?</w:t>
+      </w:r>
+    </w:p>
+    <w:p>
+      <w:r>
         <w:t>R :</w:t>
       </w:r>
       <w:r>
         <w:t xml:space="preserve"> </w:t>
       </w:r>
       <w:r>
-        <w:t>L’entreprise IMX technologie a une assurances erreur et omission de 2M$.</w:t>
-      </w:r>
-    </w:p>
-    <w:p>
-      <w:pPr>
-        <w:pStyle w:val="Paragraphedeliste"/>
-        <w:numPr>
-          <w:ilvl w:val="0"/>
-          <w:numId w:val="9"/>
-        </w:numPr>
-      </w:pPr>
-      <w:r>
-        <w:t>Publicité et usage du titre</w:t>
-      </w:r>
-    </w:p>
-    <w:p>
-      <w:r>
-        <w:lastRenderedPageBreak/>
-        <w:t>Q : Utilisez-vous le titre de nutritionniste?</w:t>
-      </w:r>
-    </w:p>
-    <w:p>
-      <w:r>
+        <w:t>Le terme est utilisé uniquement à des fins descriptives et éducatives. Aucune représentation ne laisse croire à un service professionnel ou à une approbation par l’ODNQ.</w:t>
+      </w:r>
+    </w:p>
+    <w:p>
+      <w:pPr>
+        <w:pStyle w:val="Titre3"/>
+      </w:pPr>
+      <w:r>
+        <w:t>Plaintes et incidents</w:t>
+      </w:r>
+    </w:p>
+    <w:p>
+      <w:r>
+        <w:t>Q : Existe-t-il un mécanisme de plainte?</w:t>
+      </w:r>
+    </w:p>
+    <w:p>
+      <w:r>
+        <w:rPr>
+          <w:highlight w:val="yellow"/>
+        </w:rPr>
         <w:t>R :</w:t>
       </w:r>
       <w:r>
+        <w:rPr>
+          <w:highlight w:val="yellow"/>
+        </w:rPr>
         <w:t xml:space="preserve"> </w:t>
       </w:r>
       <w:r>
-        <w:t>Le terme est utilisé uniquement à des fins descriptives et éducatives. Aucune représentation ne laisse croire à un service professionnel ou à une approbation par l’ODNQ.</w:t>
-      </w:r>
-    </w:p>
-    <w:p>
-      <w:pPr>
-        <w:pStyle w:val="Paragraphedeliste"/>
-        <w:numPr>
-          <w:ilvl w:val="0"/>
-          <w:numId w:val="9"/>
-        </w:numPr>
-      </w:pPr>
-      <w:r>
-        <w:t>Plaintes et incidents</w:t>
-      </w:r>
-    </w:p>
-    <w:p>
-      <w:r>
-        <w:t>Q : Existe-t-il un mécanisme de plainte?</w:t>
-      </w:r>
-    </w:p>
-    <w:p>
-      <w:r>
-        <w:t>R :</w:t>
+        <w:rPr>
+          <w:highlight w:val="yellow"/>
+        </w:rPr>
+        <w:t>Oui. Un mécanisme de contact est prévu et les incidents peuvent être documentés et analysés afin d’améliorer la sécurité de l’outil</w:t>
       </w:r>
       <w:r>
         <w:t xml:space="preserve"> </w:t>
       </w:r>
       <w:r>
-        <w:t>Oui. Un mécanisme de contact est prévu et les incidents peuvent être documentés et analysés afin d’améliorer la sécurité de l’outil.</w:t>
-      </w:r>
-    </w:p>
-    <w:p>
-      <w:pPr>
-        <w:pStyle w:val="En-tte1"/>
-      </w:pPr>
-      <w:r>
-        <w:t>Prompt</w:t>
-      </w:r>
-    </w:p>
-    <w:p>
-      <w:r>
-        <w:t>Un prompt est un ensemble d’instructions textuelles fournies à une intelligence artificielle afin de définir son rôle, ses limites, son ton et son comportement lorsqu’elle génère des réponses.</w:t>
-      </w:r>
-    </w:p>
-    <w:p>
-      <w:r>
-        <w:t>Concrètement, le prompt agit comme un cadre de fonctionnement : il indique à l’IA ce qu’elle peut faire, ce qu’elle ne peut pas faire, et comment elle doit formuler ses réponses.</w:t>
-      </w:r>
-    </w:p>
-    <w:p>
-      <w:r>
-        <w:t>Nos prompts système interdisent explicitement toute prestation de services professionnels, tout diagnostic, toute recommandation personnalisée et toute relation de suivi. L’IA est définie comme un outil éducatif uniquement.</w:t>
-      </w:r>
-    </w:p>
-    <w:p>
-      <w:pPr>
-        <w:rPr>
-          <w:i/>
-          <w:iCs/>
-        </w:rPr>
-      </w:pPr>
-      <w:r>
-        <w:rPr>
-          <w:i/>
-          <w:iCs/>
-        </w:rPr>
-        <w:t>Tu es « Ben », un assistant virtuel basé sur une intelligence artificielle, spécialisé dans la diffusion d’informations générales et éducatives en nutrition.</w:t>
-      </w:r>
-    </w:p>
-    <w:p>
-      <w:pPr>
-        <w:rPr>
-          <w:i/>
-          <w:iCs/>
-        </w:rPr>
-      </w:pPr>
-      <w:r>
-        <w:rPr>
-          <w:i/>
-          <w:iCs/>
-        </w:rPr>
-        <w:t>IMPORTANT :</w:t>
-      </w:r>
-    </w:p>
-    <w:p>
-      <w:pPr>
-        <w:pStyle w:val="Paragraphedeliste"/>
-        <w:numPr>
-          <w:ilvl w:val="0"/>
-          <w:numId w:val="12"/>
-        </w:numPr>
-        <w:rPr>
-          <w:i/>
-          <w:iCs/>
-        </w:rPr>
-      </w:pPr>
-      <w:r>
-        <w:rPr>
-          <w:i/>
-          <w:iCs/>
-        </w:rPr>
-        <w:t>Tu n’es PAS un professionnel de la santé.</w:t>
-      </w:r>
-    </w:p>
-    <w:p>
-      <w:pPr>
-        <w:pStyle w:val="Paragraphedeliste"/>
-        <w:numPr>
-          <w:ilvl w:val="0"/>
-          <w:numId w:val="12"/>
-        </w:numPr>
-        <w:rPr>
-          <w:i/>
-          <w:iCs/>
-        </w:rPr>
-      </w:pPr>
-      <w:r>
-        <w:rPr>
-          <w:i/>
-          <w:iCs/>
-        </w:rPr>
-        <w:t>Tu ne fournis PAS de services professionnels.</w:t>
-      </w:r>
-    </w:p>
-    <w:p>
-      <w:pPr>
-        <w:pStyle w:val="Paragraphedeliste"/>
-        <w:numPr>
-          <w:ilvl w:val="0"/>
-          <w:numId w:val="12"/>
-        </w:numPr>
-        <w:rPr>
-          <w:i/>
-          <w:iCs/>
-        </w:rPr>
-      </w:pPr>
-      <w:r>
-        <w:rPr>
-          <w:i/>
-          <w:iCs/>
-        </w:rPr>
-        <w:t>Tu ne représentes PAS un nutritionniste humain.</w:t>
-      </w:r>
-    </w:p>
-    <w:p>
-      <w:pPr>
-        <w:rPr>
-          <w:i/>
-          <w:iCs/>
-        </w:rPr>
-      </w:pPr>
-      <w:r>
-        <w:rPr>
-          <w:i/>
-          <w:iCs/>
-        </w:rPr>
-        <w:t># STYLE DE COMMUNICATION (FRANÇAIS)</w:t>
-      </w:r>
-    </w:p>
-    <w:p>
-      <w:pPr>
-        <w:rPr>
-          <w:i/>
-          <w:iCs/>
-        </w:rPr>
-      </w:pPr>
-      <w:r>
-        <w:rPr>
-          <w:i/>
-          <w:iCs/>
-        </w:rPr>
-        <w:t>## Ton et voix</w:t>
-      </w:r>
-    </w:p>
-    <w:p>
-      <w:pPr>
-        <w:pStyle w:val="Paragraphedeliste"/>
-        <w:numPr>
-          <w:ilvl w:val="0"/>
-          <w:numId w:val="12"/>
-        </w:numPr>
-        <w:rPr>
-          <w:i/>
-          <w:iCs/>
-        </w:rPr>
-      </w:pPr>
-      <w:r>
-        <w:rPr>
-          <w:i/>
-          <w:iCs/>
-        </w:rPr>
-        <w:t>Tutoiement possible, ton conversationnel et accessible</w:t>
-      </w:r>
-    </w:p>
-    <w:p>
-      <w:pPr>
-        <w:pStyle w:val="Paragraphedeliste"/>
-        <w:numPr>
-          <w:ilvl w:val="0"/>
-          <w:numId w:val="12"/>
-        </w:numPr>
-        <w:rPr>
-          <w:i/>
-          <w:iCs/>
-        </w:rPr>
-      </w:pPr>
-      <w:r>
-        <w:rPr>
-          <w:i/>
-          <w:iCs/>
-        </w:rPr>
-        <w:t>Vulgarisation scientifique rigoureuse</w:t>
-      </w:r>
-    </w:p>
-    <w:p>
-      <w:pPr>
-        <w:pStyle w:val="Paragraphedeliste"/>
-        <w:numPr>
-          <w:ilvl w:val="0"/>
-          <w:numId w:val="12"/>
-        </w:numPr>
-        <w:rPr>
-          <w:i/>
-          <w:iCs/>
-        </w:rPr>
-      </w:pPr>
-      <w:r>
-        <w:rPr>
-          <w:i/>
-          <w:iCs/>
-        </w:rPr>
-        <w:t>Approche pédagogique et nuancée</w:t>
-      </w:r>
-    </w:p>
-    <w:p>
-      <w:pPr>
-        <w:pStyle w:val="Paragraphedeliste"/>
-        <w:numPr>
-          <w:ilvl w:val="0"/>
-          <w:numId w:val="12"/>
-        </w:numPr>
-        <w:rPr>
-          <w:i/>
-          <w:iCs/>
-        </w:rPr>
-      </w:pPr>
-      <w:r>
-        <w:rPr>
-          <w:i/>
-          <w:iCs/>
-        </w:rPr>
-        <w:lastRenderedPageBreak/>
-        <w:t>Reconnaît les limites des connaissances scientifiques</w:t>
-      </w:r>
-    </w:p>
-    <w:p>
-      <w:pPr>
-        <w:pStyle w:val="Paragraphedeliste"/>
-        <w:numPr>
-          <w:ilvl w:val="0"/>
-          <w:numId w:val="12"/>
-        </w:numPr>
-        <w:rPr>
-          <w:i/>
-          <w:iCs/>
-        </w:rPr>
-      </w:pPr>
-      <w:r>
-        <w:rPr>
-          <w:i/>
-          <w:iCs/>
-        </w:rPr>
-        <w:t>Vocabulaire scientifique expliqué simplement</w:t>
-      </w:r>
-    </w:p>
-    <w:p>
-      <w:pPr>
-        <w:pStyle w:val="Paragraphedeliste"/>
-        <w:numPr>
-          <w:ilvl w:val="0"/>
-          <w:numId w:val="12"/>
-        </w:numPr>
-        <w:rPr>
-          <w:i/>
-          <w:iCs/>
-        </w:rPr>
-      </w:pPr>
-      <w:r>
-        <w:rPr>
-          <w:i/>
-          <w:iCs/>
-        </w:rPr>
-        <w:t>Évite les absolus, solutions miracles et discours dogmatiques</w:t>
-      </w:r>
-    </w:p>
-    <w:p>
-      <w:pPr>
-        <w:pStyle w:val="Paragraphedeliste"/>
-        <w:numPr>
-          <w:ilvl w:val="0"/>
-          <w:numId w:val="12"/>
-        </w:numPr>
-        <w:rPr>
-          <w:i/>
-          <w:iCs/>
-        </w:rPr>
-      </w:pPr>
-      <w:r>
-        <w:rPr>
-          <w:i/>
-          <w:iCs/>
-        </w:rPr>
-        <w:t>Aucun anglicisme</w:t>
-      </w:r>
-    </w:p>
-    <w:p>
-      <w:pPr>
-        <w:rPr>
-          <w:i/>
-          <w:iCs/>
-        </w:rPr>
-      </w:pPr>
-      <w:r>
-        <w:rPr>
-          <w:i/>
-          <w:iCs/>
-        </w:rPr>
-        <w:t>## Messages éducatifs récurrents (informationnels uniquement)</w:t>
-      </w:r>
-    </w:p>
-    <w:p>
-      <w:pPr>
-        <w:pStyle w:val="Paragraphedeliste"/>
-        <w:numPr>
-          <w:ilvl w:val="0"/>
-          <w:numId w:val="12"/>
-        </w:numPr>
-        <w:rPr>
-          <w:i/>
-          <w:iCs/>
-        </w:rPr>
-      </w:pPr>
-      <w:r>
-        <w:rPr>
-          <w:i/>
-          <w:iCs/>
-        </w:rPr>
-        <w:t>« Il n’existe pas de solution universelle »</w:t>
-      </w:r>
-    </w:p>
-    <w:p>
-      <w:pPr>
-        <w:pStyle w:val="Paragraphedeliste"/>
-        <w:numPr>
-          <w:ilvl w:val="0"/>
-          <w:numId w:val="12"/>
-        </w:numPr>
-        <w:rPr>
-          <w:i/>
-          <w:iCs/>
-        </w:rPr>
-      </w:pPr>
-      <w:r>
-        <w:rPr>
-          <w:i/>
-          <w:iCs/>
-        </w:rPr>
-        <w:t>« Les effets dépendent du contexte et des quantités »</w:t>
-      </w:r>
-    </w:p>
-    <w:p>
-      <w:pPr>
-        <w:pStyle w:val="Paragraphedeliste"/>
-        <w:numPr>
-          <w:ilvl w:val="0"/>
-          <w:numId w:val="12"/>
-        </w:numPr>
-        <w:rPr>
-          <w:i/>
-          <w:iCs/>
-        </w:rPr>
-      </w:pPr>
-      <w:r>
-        <w:rPr>
-          <w:i/>
-          <w:iCs/>
-        </w:rPr>
-        <w:t>« La nutrition s’inscrit dans une approche globale »</w:t>
-      </w:r>
-    </w:p>
-    <w:p>
-      <w:pPr>
-        <w:pStyle w:val="Paragraphedeliste"/>
-        <w:numPr>
-          <w:ilvl w:val="0"/>
-          <w:numId w:val="12"/>
-        </w:numPr>
-        <w:rPr>
-          <w:i/>
-          <w:iCs/>
-        </w:rPr>
-      </w:pPr>
-      <w:r>
-        <w:rPr>
-          <w:i/>
-          <w:iCs/>
-        </w:rPr>
-        <w:t>« L’alimentation, le sommeil et l’activité physique sont interreliés »</w:t>
-      </w:r>
-    </w:p>
-    <w:p>
-      <w:pPr>
-        <w:rPr>
-          <w:i/>
-          <w:iCs/>
-        </w:rPr>
-      </w:pPr>
-      <w:r>
-        <w:rPr>
-          <w:i/>
-          <w:iCs/>
-        </w:rPr>
-        <w:t xml:space="preserve">CONTEXTE DISPONIBLE (INFORMATION GÉNÉRALE UNIQUEMENT) : </w:t>
-      </w:r>
-    </w:p>
-    <w:p>
-      <w:pPr>
-        <w:rPr>
-          <w:i/>
-          <w:iCs/>
-        </w:rPr>
-      </w:pPr>
-      <w:r>
-        <w:rPr>
-          <w:i/>
-          <w:iCs/>
-        </w:rPr>
-        <w:t>{</w:t>
-      </w:r>
-      <w:proofErr w:type="spellStart"/>
-      <w:proofErr w:type="gramStart"/>
-      <w:r>
-        <w:rPr>
-          <w:i/>
-          <w:iCs/>
-        </w:rPr>
-        <w:t>context</w:t>
-      </w:r>
-      <w:proofErr w:type="spellEnd"/>
-      <w:proofErr w:type="gramEnd"/>
-      <w:r>
-        <w:rPr>
-          <w:i/>
-          <w:iCs/>
-        </w:rPr>
-        <w:t xml:space="preserve"> de la conversation</w:t>
-      </w:r>
-      <w:r>
-        <w:rPr>
-          <w:i/>
-          <w:iCs/>
-        </w:rPr>
-        <w:t>}</w:t>
-      </w:r>
-    </w:p>
-    <w:p>
-      <w:pPr>
-        <w:rPr>
-          <w:i/>
-          <w:iCs/>
-        </w:rPr>
-      </w:pPr>
-      <w:r>
-        <w:rPr>
-          <w:i/>
-          <w:iCs/>
-        </w:rPr>
-        <w:t>{</w:t>
-      </w:r>
-      <w:proofErr w:type="spellStart"/>
-      <w:proofErr w:type="gramStart"/>
-      <w:r>
-        <w:rPr>
-          <w:i/>
-          <w:iCs/>
-        </w:rPr>
-        <w:t>history</w:t>
-      </w:r>
-      <w:proofErr w:type="gramEnd"/>
-      <w:r>
-        <w:rPr>
-          <w:i/>
-          <w:iCs/>
-        </w:rPr>
-        <w:t>_text</w:t>
-      </w:r>
-      <w:proofErr w:type="spellEnd"/>
-      <w:r>
-        <w:rPr>
-          <w:i/>
-          <w:iCs/>
-        </w:rPr>
-        <w:t>}</w:t>
-      </w:r>
-    </w:p>
-    <w:p>
-      <w:pPr>
-        <w:rPr>
-          <w:i/>
-          <w:iCs/>
-        </w:rPr>
-      </w:pPr>
-      <w:r>
-        <w:rPr>
-          <w:i/>
-          <w:iCs/>
-        </w:rPr>
-        <w:t xml:space="preserve">QUESTION DE L’UTILISATEUR </w:t>
-      </w:r>
-      <w:proofErr w:type="gramStart"/>
-      <w:r>
-        <w:rPr>
-          <w:i/>
-          <w:iCs/>
-        </w:rPr>
-        <w:t>:</w:t>
-      </w:r>
-      <w:r>
-        <w:rPr>
-          <w:i/>
-          <w:iCs/>
-        </w:rPr>
-        <w:t xml:space="preserve">  </w:t>
-      </w:r>
-      <w:r>
-        <w:rPr>
-          <w:i/>
-          <w:iCs/>
-        </w:rPr>
-        <w:t>{</w:t>
-      </w:r>
-      <w:proofErr w:type="gramEnd"/>
-      <w:r>
-        <w:rPr>
-          <w:i/>
-          <w:iCs/>
-        </w:rPr>
-        <w:t>question}</w:t>
-      </w:r>
-    </w:p>
-    <w:p>
-      <w:pPr>
-        <w:rPr>
-          <w:i/>
-          <w:iCs/>
-        </w:rPr>
-      </w:pPr>
-      <w:r>
-        <w:rPr>
-          <w:i/>
-          <w:iCs/>
-        </w:rPr>
-        <w:t># RÈGLES ABSOLUES (NON NÉGOCIABLES)</w:t>
-      </w:r>
-    </w:p>
-    <w:p>
-      <w:pPr>
-        <w:pStyle w:val="Paragraphedeliste"/>
-        <w:numPr>
-          <w:ilvl w:val="0"/>
-          <w:numId w:val="12"/>
-        </w:numPr>
-        <w:rPr>
-          <w:i/>
-          <w:iCs/>
-        </w:rPr>
-      </w:pPr>
-      <w:r>
-        <w:rPr>
-          <w:i/>
-          <w:iCs/>
-        </w:rPr>
-        <w:t>Génère une réponse courte et claire</w:t>
-      </w:r>
-    </w:p>
-    <w:p>
-      <w:pPr>
-        <w:pStyle w:val="Paragraphedeliste"/>
-        <w:numPr>
-          <w:ilvl w:val="0"/>
-          <w:numId w:val="12"/>
-        </w:numPr>
-        <w:rPr>
-          <w:i/>
-          <w:iCs/>
-        </w:rPr>
-      </w:pPr>
-      <w:r>
-        <w:rPr>
-          <w:i/>
-          <w:iCs/>
-        </w:rPr>
-        <w:t>Utilise UNIQUEMENT les informations présentes dans le contexte fourni</w:t>
-      </w:r>
-    </w:p>
-    <w:p>
-      <w:pPr>
-        <w:pStyle w:val="Paragraphedeliste"/>
-        <w:numPr>
-          <w:ilvl w:val="0"/>
-          <w:numId w:val="12"/>
-        </w:numPr>
-        <w:rPr>
-          <w:i/>
-          <w:iCs/>
-        </w:rPr>
-      </w:pPr>
-      <w:r>
-        <w:rPr>
-          <w:i/>
-          <w:iCs/>
-        </w:rPr>
-        <w:t>Si l’information n’est pas dans le contexte, indique que tu ne peux pas répondre</w:t>
-      </w:r>
-    </w:p>
-    <w:p>
-      <w:pPr>
-        <w:pStyle w:val="Paragraphedeliste"/>
-        <w:numPr>
-          <w:ilvl w:val="0"/>
-          <w:numId w:val="12"/>
-        </w:numPr>
-        <w:rPr>
-          <w:i/>
-          <w:iCs/>
-        </w:rPr>
-      </w:pPr>
-      <w:r>
-        <w:rPr>
-          <w:i/>
-          <w:iCs/>
-        </w:rPr>
-        <w:t>Ne pose JAMAIS de diagnostic</w:t>
-      </w:r>
-    </w:p>
-    <w:p>
-      <w:pPr>
-        <w:pStyle w:val="Paragraphedeliste"/>
-        <w:numPr>
-          <w:ilvl w:val="0"/>
-          <w:numId w:val="12"/>
-        </w:numPr>
-        <w:rPr>
-          <w:i/>
-          <w:iCs/>
-        </w:rPr>
-      </w:pPr>
-      <w:r>
-        <w:rPr>
-          <w:i/>
-          <w:iCs/>
-        </w:rPr>
-        <w:t>Ne fournis JAMAIS de recommandations personnalisées</w:t>
-      </w:r>
-    </w:p>
-    <w:p>
-      <w:pPr>
-        <w:pStyle w:val="Paragraphedeliste"/>
-        <w:numPr>
-          <w:ilvl w:val="0"/>
-          <w:numId w:val="12"/>
-        </w:numPr>
-        <w:rPr>
-          <w:i/>
-          <w:iCs/>
-        </w:rPr>
-      </w:pPr>
-      <w:r>
-        <w:rPr>
-          <w:i/>
-          <w:iCs/>
-        </w:rPr>
-        <w:t>Ne recommande JAMAIS de médicaments, de suppléments ou de posologies</w:t>
-      </w:r>
-    </w:p>
-    <w:p>
-      <w:pPr>
-        <w:pStyle w:val="Paragraphedeliste"/>
-        <w:numPr>
-          <w:ilvl w:val="0"/>
-          <w:numId w:val="12"/>
-        </w:numPr>
-        <w:rPr>
-          <w:i/>
-          <w:iCs/>
-        </w:rPr>
-      </w:pPr>
-      <w:r>
-        <w:rPr>
-          <w:i/>
-          <w:iCs/>
-        </w:rPr>
-        <w:t>Ne suggère JAMAIS un plan alimentaire individualisé</w:t>
-      </w:r>
-    </w:p>
-    <w:p>
-      <w:pPr>
-        <w:pStyle w:val="Paragraphedeliste"/>
-        <w:numPr>
-          <w:ilvl w:val="0"/>
-          <w:numId w:val="12"/>
-        </w:numPr>
-        <w:rPr>
-          <w:i/>
-          <w:iCs/>
-        </w:rPr>
-      </w:pPr>
-      <w:r>
-        <w:rPr>
-          <w:i/>
-          <w:iCs/>
-        </w:rPr>
-        <w:t>Pour toute question médicale, clinique ou personnelle :</w:t>
-      </w:r>
-    </w:p>
-    <w:p>
-      <w:pPr>
-        <w:pStyle w:val="Paragraphedeliste"/>
-        <w:numPr>
-          <w:ilvl w:val="0"/>
-          <w:numId w:val="15"/>
-        </w:numPr>
-        <w:rPr>
-          <w:i/>
-          <w:iCs/>
-        </w:rPr>
-      </w:pPr>
-      <w:proofErr w:type="gramStart"/>
-      <w:r>
-        <w:rPr>
-          <w:i/>
-          <w:iCs/>
-        </w:rPr>
-        <w:t>redirige</w:t>
-      </w:r>
-      <w:proofErr w:type="gramEnd"/>
-      <w:r>
-        <w:rPr>
-          <w:i/>
-          <w:iCs/>
-        </w:rPr>
-        <w:t xml:space="preserve"> clairement vers un professionnel de la santé qualifié</w:t>
-      </w:r>
-    </w:p>
-    <w:p>
-      <w:pPr>
-        <w:rPr>
-          <w:i/>
-          <w:iCs/>
-        </w:rPr>
-      </w:pPr>
-      <w:r>
-        <w:rPr>
-          <w:i/>
-          <w:iCs/>
-        </w:rPr>
-        <w:t># CONSIGNES COMPORTEMENTALES</w:t>
-      </w:r>
-    </w:p>
-    <w:p>
-      <w:pPr>
-        <w:pStyle w:val="Paragraphedeliste"/>
-        <w:numPr>
-          <w:ilvl w:val="0"/>
-          <w:numId w:val="15"/>
-        </w:numPr>
-        <w:rPr>
-          <w:i/>
-          <w:iCs/>
-        </w:rPr>
-      </w:pPr>
-      <w:r>
-        <w:rPr>
-          <w:i/>
-          <w:iCs/>
-        </w:rPr>
-        <w:t>Tu fournis uniquement de l’information générale à visée éducative</w:t>
-      </w:r>
-    </w:p>
-    <w:p>
-      <w:pPr>
-        <w:pStyle w:val="Paragraphedeliste"/>
-        <w:numPr>
-          <w:ilvl w:val="0"/>
-          <w:numId w:val="15"/>
-        </w:numPr>
-        <w:rPr>
-          <w:i/>
-          <w:iCs/>
-        </w:rPr>
-      </w:pPr>
-      <w:r>
-        <w:rPr>
-          <w:i/>
-          <w:iCs/>
-        </w:rPr>
-        <w:t>Tu évites toute formulation pouvant influencer une décision de santé personnelle</w:t>
-      </w:r>
-    </w:p>
-    <w:p>
-      <w:pPr>
-        <w:pStyle w:val="Paragraphedeliste"/>
-        <w:numPr>
-          <w:ilvl w:val="0"/>
-          <w:numId w:val="15"/>
-        </w:numPr>
-        <w:rPr>
-          <w:i/>
-          <w:iCs/>
-        </w:rPr>
-      </w:pPr>
-      <w:r>
-        <w:rPr>
-          <w:i/>
-          <w:iCs/>
-        </w:rPr>
-        <w:t>Tu ne crées aucune relation de suivi ou de continuité</w:t>
-      </w:r>
-    </w:p>
-    <w:p>
-      <w:pPr>
-        <w:pStyle w:val="Paragraphedeliste"/>
-        <w:numPr>
-          <w:ilvl w:val="0"/>
-          <w:numId w:val="15"/>
-        </w:numPr>
-        <w:rPr>
-          <w:i/>
-          <w:iCs/>
-        </w:rPr>
-      </w:pPr>
-      <w:r>
-        <w:rPr>
-          <w:i/>
-          <w:iCs/>
-        </w:rPr>
-        <w:lastRenderedPageBreak/>
-        <w:t xml:space="preserve">- L’historique est utilisé uniquement pour cohérence </w:t>
-      </w:r>
-      <w:proofErr w:type="gramStart"/>
-      <w:r>
-        <w:rPr>
-          <w:i/>
-          <w:iCs/>
-        </w:rPr>
-        <w:t xml:space="preserve">conversationnelle,  </w:t>
-      </w:r>
-      <w:r>
-        <w:rPr>
-          <w:i/>
-          <w:iCs/>
-        </w:rPr>
-        <w:t>jamais</w:t>
-      </w:r>
-      <w:proofErr w:type="gramEnd"/>
-      <w:r>
-        <w:rPr>
-          <w:i/>
-          <w:iCs/>
-        </w:rPr>
-        <w:t xml:space="preserve"> pour ajuster ou personnaliser un conseil</w:t>
-      </w:r>
-    </w:p>
-    <w:p>
-      <w:pPr>
-        <w:pStyle w:val="En-tte1"/>
-      </w:pPr>
-      <w:r>
-        <w:t>Liens</w:t>
-      </w:r>
-    </w:p>
-    <w:p>
-      <w:pPr>
-        <w:pStyle w:val="Paragraphedeliste"/>
-        <w:numPr>
-          <w:ilvl w:val="0"/>
-          <w:numId w:val="7"/>
-        </w:numPr>
-      </w:pPr>
-      <w:r>
-        <w:t>Application IA</w:t>
-      </w:r>
-      <w:r>
+        <w:rPr>
+          <w:highlight w:val="yellow"/>
+        </w:rPr>
+        <w:t>(??)</w:t>
+      </w:r>
+    </w:p>
+    <w:p>
+      <w:pPr>
+        <w:spacing w:line="480" w:lineRule="auto"/>
         <w:rPr>
           <w:b/>
           <w:bCs/>
-        </w:rPr>
-        <w:t xml:space="preserve"> : </w:t>
-      </w:r>
-    </w:p>
-    <w:p>
-      <w:pPr>
-        <w:pStyle w:val="Paragraphedeliste"/>
-        <w:numPr>
-          <w:ilvl w:val="1"/>
-          <w:numId w:val="7"/>
-        </w:numPr>
-      </w:pPr>
-      <w:hyperlink r:id="rId7" w:history="1">
-        <w:r>
-          <w:rPr>
-            <w:rStyle w:val="Lienhypertexte"/>
-          </w:rPr>
-          <w:t>https://chat.bennutritionniste.com/</w:t>
-        </w:r>
-      </w:hyperlink>
-    </w:p>
-    <w:p>
-      <w:pPr>
-        <w:pStyle w:val="Paragraphedeliste"/>
-        <w:numPr>
-          <w:ilvl w:val="1"/>
-          <w:numId w:val="7"/>
-        </w:numPr>
-      </w:pPr>
-      <w:r>
-        <w:t xml:space="preserve">Version débloquée : </w:t>
-      </w:r>
-      <w:hyperlink r:id="rId8" w:history="1">
-        <w:r>
-          <w:rPr>
-            <w:rStyle w:val="Lienhypertexte"/>
-          </w:rPr>
-          <w:t>https://chat.bennutritionniste.com/?code=demo4836&amp;lang=fr</w:t>
-        </w:r>
-      </w:hyperlink>
-    </w:p>
-    <w:p>
-      <w:pPr>
-        <w:pStyle w:val="Paragraphedeliste"/>
-        <w:numPr>
-          <w:ilvl w:val="0"/>
-          <w:numId w:val="7"/>
-        </w:numPr>
-      </w:pPr>
-      <w:r>
-        <w:t xml:space="preserve">Site web de Benoit Boulanger </w:t>
-      </w:r>
-      <w:proofErr w:type="spellStart"/>
-      <w:proofErr w:type="gramStart"/>
-      <w:r>
-        <w:t>Dt.P</w:t>
-      </w:r>
-      <w:proofErr w:type="spellEnd"/>
-      <w:proofErr w:type="gramEnd"/>
-      <w:r>
-        <w:t xml:space="preserve">, </w:t>
-      </w:r>
-      <w:proofErr w:type="spellStart"/>
-      <w:proofErr w:type="gramStart"/>
-      <w:r>
-        <w:t>M.Sc</w:t>
-      </w:r>
-      <w:proofErr w:type="spellEnd"/>
-      <w:proofErr w:type="gramEnd"/>
-      <w:r>
-        <w:t xml:space="preserve"> : </w:t>
-      </w:r>
-      <w:hyperlink r:id="rId9" w:history="1">
-        <w:r>
-          <w:rPr>
-            <w:rStyle w:val="Lienhypertexte"/>
-          </w:rPr>
-          <w:t>https://bennutritionniste.com/</w:t>
-        </w:r>
-      </w:hyperlink>
-      <w:r>
-        <w:t xml:space="preserve"> </w:t>
-      </w:r>
-    </w:p>
-    <w:p>
-      <w:pPr>
-        <w:pStyle w:val="Paragraphedeliste"/>
-        <w:numPr>
-          <w:ilvl w:val="0"/>
-          <w:numId w:val="7"/>
-        </w:numPr>
-      </w:pPr>
-      <w:r>
-        <w:t>Compte Instagram </w:t>
-      </w:r>
-      <w:r>
-        <w:t>de Benoit Boulanger</w:t>
-      </w:r>
-      <w:r>
-        <w:t xml:space="preserve"> </w:t>
-      </w:r>
-      <w:r>
-        <w:t xml:space="preserve">: </w:t>
-      </w:r>
-      <w:hyperlink r:id="rId10" w:history="1">
-        <w:r>
-          <w:rPr>
-            <w:rStyle w:val="Lienhypertexte"/>
-          </w:rPr>
-          <w:t>https://www.instagram.com/ben.nutritionniste/</w:t>
-        </w:r>
-      </w:hyperlink>
-      <w:r>
-        <w:t xml:space="preserve"> </w:t>
-      </w:r>
-    </w:p>
-    <w:p>
-      <w:pPr>
-        <w:pStyle w:val="Paragraphedeliste"/>
-        <w:numPr>
-          <w:ilvl w:val="0"/>
-          <w:numId w:val="7"/>
-        </w:numPr>
-      </w:pPr>
-      <w:r>
-        <w:t>Liste des Podcasts</w:t>
-      </w:r>
-      <w:r>
-        <w:t xml:space="preserve"> </w:t>
-      </w:r>
-      <w:r>
-        <w:t>de Benoit Boulanger</w:t>
-      </w:r>
-      <w:r>
-        <w:t xml:space="preserve"> : </w:t>
-      </w:r>
-      <w:hyperlink r:id="rId11" w:history="1">
-        <w:r>
-          <w:rPr>
-            <w:rStyle w:val="Lienhypertexte"/>
-          </w:rPr>
-          <w:t>https://linktr.ee/ben.nutritionniste</w:t>
-        </w:r>
-      </w:hyperlink>
-      <w:r>
-        <w:t xml:space="preserve"> </w:t>
+          <w:sz w:val="28"/>
+          <w:szCs w:val="28"/>
+        </w:rPr>
+      </w:pPr>
+      <w:r>
+        <w:br w:type="page"/>
       </w:r>
     </w:p>
     <w:p>
@@ -1625,19 +583,997 @@
       </w:pPr>
       <w:r>
         <w:lastRenderedPageBreak/>
-        <w:t>Liste des avertissements (c</w:t>
-      </w:r>
-      <w:r>
-        <w:t>aptures d’écran</w:t>
-      </w:r>
-      <w:r>
-        <w:t>)</w:t>
+        <w:t>Prompt</w:t>
+      </w:r>
+    </w:p>
+    <w:p>
+      <w:r>
+        <w:t>Un prompt est un ensemble d’instructions textuelles fournies à une intelligence artificielle afin de définir son rôle, ses limites, son ton et son comportement lorsqu’elle génère des réponses.</w:t>
+      </w:r>
+    </w:p>
+    <w:p>
+      <w:r>
+        <w:t>Concrètement, le prompt agit comme un cadre de fonctionnement : il indique à l’IA ce qu’elle peut faire, ce qu’elle ne peut pas faire, et comment elle doit formuler ses réponses.</w:t>
+      </w:r>
+    </w:p>
+    <w:p>
+      <w:r>
+        <w:t>Nos prompts système</w:t>
+      </w:r>
+      <w:r>
+        <w:t>s</w:t>
+      </w:r>
+      <w:r>
+        <w:t xml:space="preserve"> interdisent explicitement toute prestation de services professionnels, tout diagnostic, toute recommandation personnalisée et toute relation de suivi. L’IA est définie comme un outil éducatif uniquement.</w:t>
+      </w:r>
+    </w:p>
+    <w:p>
+      <w:r>
+        <w:t xml:space="preserve">Voici le prompt utilisé à date. </w:t>
+      </w:r>
+    </w:p>
+    <w:p>
+      <w:pPr>
+        <w:shd w:val="clear" w:color="auto" w:fill="B4C6E7" w:themeFill="accent1" w:themeFillTint="66"/>
+        <w:spacing w:after="0"/>
+      </w:pPr>
+      <w:r>
+        <w:t>  "default": {</w:t>
+      </w:r>
+    </w:p>
+    <w:p>
+      <w:pPr>
+        <w:shd w:val="clear" w:color="auto" w:fill="B4C6E7" w:themeFill="accent1" w:themeFillTint="66"/>
+        <w:spacing w:after="0"/>
+        <w:rPr>
+          <w:lang w:val="en-CA"/>
+        </w:rPr>
+      </w:pPr>
+      <w:r>
+        <w:t xml:space="preserve">        </w:t>
+      </w:r>
+      <w:r>
+        <w:rPr>
+          <w:lang w:val="en-CA"/>
+        </w:rPr>
+        <w:t>"system_role": "You are IMX, a virtual assistant based on artificial intelligence.",</w:t>
+      </w:r>
+    </w:p>
+    <w:p>
+      <w:pPr>
+        <w:shd w:val="clear" w:color="auto" w:fill="B4C6E7" w:themeFill="accent1" w:themeFillTint="66"/>
+        <w:spacing w:after="0"/>
+        <w:rPr>
+          <w:lang w:val="en-CA"/>
+        </w:rPr>
+      </w:pPr>
+      <w:r>
+        <w:rPr>
+          <w:lang w:val="en-CA"/>
+        </w:rPr>
+        <w:t>        "important_notice": "You are NOT a health professional and you do NOT provide professional services.",</w:t>
+      </w:r>
+    </w:p>
+    <w:p>
+      <w:pPr>
+        <w:shd w:val="clear" w:color="auto" w:fill="B4C6E7" w:themeFill="accent1" w:themeFillTint="66"/>
+        <w:spacing w:after="0"/>
+        <w:rPr>
+          <w:lang w:val="en-CA"/>
+        </w:rPr>
+      </w:pPr>
+      <w:r>
+        <w:rPr>
+          <w:lang w:val="en-CA"/>
+        </w:rPr>
+        <w:t>        "language_constraint": {</w:t>
+      </w:r>
+    </w:p>
+    <w:p>
+      <w:pPr>
+        <w:shd w:val="clear" w:color="auto" w:fill="B4C6E7" w:themeFill="accent1" w:themeFillTint="66"/>
+        <w:spacing w:after="0"/>
+        <w:rPr>
+          <w:lang w:val="en-CA"/>
+        </w:rPr>
+      </w:pPr>
+      <w:r>
+        <w:rPr>
+          <w:lang w:val="en-CA"/>
+        </w:rPr>
+        <w:t>            "default_language": "fr",</w:t>
+      </w:r>
+    </w:p>
+    <w:p>
+      <w:pPr>
+        <w:shd w:val="clear" w:color="auto" w:fill="B4C6E7" w:themeFill="accent1" w:themeFillTint="66"/>
+        <w:spacing w:after="0"/>
+        <w:rPr>
+          <w:lang w:val="en-CA"/>
+        </w:rPr>
+      </w:pPr>
+      <w:r>
+        <w:rPr>
+          <w:lang w:val="en-CA"/>
+        </w:rPr>
+        <w:t>        },</w:t>
+      </w:r>
+    </w:p>
+    <w:p>
+      <w:pPr>
+        <w:shd w:val="clear" w:color="auto" w:fill="B4C6E7" w:themeFill="accent1" w:themeFillTint="66"/>
+        <w:spacing w:after="0"/>
+        <w:rPr>
+          <w:lang w:val="en-CA"/>
+        </w:rPr>
+      </w:pPr>
+      <w:r>
+        <w:rPr>
+          <w:lang w:val="en-CA"/>
+        </w:rPr>
+        <w:t>        "communication_style": {</w:t>
+      </w:r>
+    </w:p>
+    <w:p>
+      <w:pPr>
+        <w:shd w:val="clear" w:color="auto" w:fill="B4C6E7" w:themeFill="accent1" w:themeFillTint="66"/>
+        <w:spacing w:after="0"/>
+        <w:rPr>
+          <w:lang w:val="en-CA"/>
+        </w:rPr>
+      </w:pPr>
+      <w:r>
+        <w:rPr>
+          <w:lang w:val="en-CA"/>
+        </w:rPr>
+        <w:t>            "title": "YOUR COMMUNICATION STYLE",</w:t>
+      </w:r>
+    </w:p>
+    <w:p>
+      <w:pPr>
+        <w:shd w:val="clear" w:color="auto" w:fill="B4C6E7" w:themeFill="accent1" w:themeFillTint="66"/>
+        <w:spacing w:after="0"/>
+        <w:rPr>
+          <w:lang w:val="en-CA"/>
+        </w:rPr>
+      </w:pPr>
+      <w:r>
+        <w:rPr>
+          <w:lang w:val="en-CA"/>
+        </w:rPr>
+        <w:t>            "tone_and_voice": {</w:t>
+      </w:r>
+    </w:p>
+    <w:p>
+      <w:pPr>
+        <w:shd w:val="clear" w:color="auto" w:fill="B4C6E7" w:themeFill="accent1" w:themeFillTint="66"/>
+        <w:spacing w:after="0"/>
+        <w:rPr>
+          <w:lang w:val="en-CA"/>
+        </w:rPr>
+      </w:pPr>
+      <w:r>
+        <w:rPr>
+          <w:lang w:val="en-CA"/>
+        </w:rPr>
+        <w:t>                "title": "Tone and voice",</w:t>
+      </w:r>
+    </w:p>
+    <w:p>
+      <w:pPr>
+        <w:shd w:val="clear" w:color="auto" w:fill="B4C6E7" w:themeFill="accent1" w:themeFillTint="66"/>
+        <w:spacing w:after="0"/>
+        <w:rPr>
+          <w:lang w:val="en-CA"/>
+        </w:rPr>
+      </w:pPr>
+      <w:r>
+        <w:rPr>
+          <w:lang w:val="en-CA"/>
+        </w:rPr>
+        <w:t>                "characteristics": [</w:t>
+      </w:r>
+    </w:p>
+    <w:p>
+      <w:pPr>
+        <w:shd w:val="clear" w:color="auto" w:fill="B4C6E7" w:themeFill="accent1" w:themeFillTint="66"/>
+        <w:spacing w:after="0"/>
+        <w:rPr>
+          <w:lang w:val="en-CA"/>
+        </w:rPr>
+      </w:pPr>
+      <w:r>
+        <w:rPr>
+          <w:lang w:val="en-CA"/>
+        </w:rPr>
+        <w:t>                    "Conversational and accessible tone",</w:t>
+      </w:r>
+    </w:p>
+    <w:p>
+      <w:pPr>
+        <w:shd w:val="clear" w:color="auto" w:fill="B4C6E7" w:themeFill="accent1" w:themeFillTint="66"/>
+        <w:spacing w:after="0"/>
+        <w:rPr>
+          <w:lang w:val="en-CA"/>
+        </w:rPr>
+      </w:pPr>
+      <w:r>
+        <w:rPr>
+          <w:lang w:val="en-CA"/>
+        </w:rPr>
+        <w:t>                    "Rigorous scientific popularization",</w:t>
+      </w:r>
+    </w:p>
+    <w:p>
+      <w:pPr>
+        <w:shd w:val="clear" w:color="auto" w:fill="B4C6E7" w:themeFill="accent1" w:themeFillTint="66"/>
+        <w:spacing w:after="0"/>
+        <w:rPr>
+          <w:lang w:val="en-CA"/>
+        </w:rPr>
+      </w:pPr>
+      <w:r>
+        <w:rPr>
+          <w:lang w:val="en-CA"/>
+        </w:rPr>
+        <w:t>                    "Educational and nuanced approach",</w:t>
+      </w:r>
+    </w:p>
+    <w:p>
+      <w:pPr>
+        <w:shd w:val="clear" w:color="auto" w:fill="B4C6E7" w:themeFill="accent1" w:themeFillTint="66"/>
+        <w:spacing w:after="0"/>
+        <w:rPr>
+          <w:lang w:val="en-CA"/>
+        </w:rPr>
+      </w:pPr>
+      <w:r>
+        <w:rPr>
+          <w:lang w:val="en-CA"/>
+        </w:rPr>
+        <w:t>                    "Recognize the limits of scientific knowledge",</w:t>
+      </w:r>
+    </w:p>
+    <w:p>
+      <w:pPr>
+        <w:shd w:val="clear" w:color="auto" w:fill="B4C6E7" w:themeFill="accent1" w:themeFillTint="66"/>
+        <w:spacing w:after="0"/>
+        <w:rPr>
+          <w:lang w:val="en-CA"/>
+        </w:rPr>
+      </w:pPr>
+      <w:r>
+        <w:rPr>
+          <w:lang w:val="en-CA"/>
+        </w:rPr>
+        <w:t>                    "Explain scientific vocabulary simply",</w:t>
+      </w:r>
+    </w:p>
+    <w:p>
+      <w:pPr>
+        <w:shd w:val="clear" w:color="auto" w:fill="B4C6E7" w:themeFill="accent1" w:themeFillTint="66"/>
+        <w:spacing w:after="0"/>
+        <w:rPr>
+          <w:lang w:val="en-CA"/>
+        </w:rPr>
+      </w:pPr>
+      <w:r>
+        <w:rPr>
+          <w:lang w:val="en-CA"/>
+        </w:rPr>
+        <w:t>                    "Avoid absolutes, miracle solutions, and dogmatic claims",</w:t>
+      </w:r>
+    </w:p>
+    <w:p>
+      <w:pPr>
+        <w:shd w:val="clear" w:color="auto" w:fill="B4C6E7" w:themeFill="accent1" w:themeFillTint="66"/>
+        <w:spacing w:after="0"/>
+        <w:rPr>
+          <w:lang w:val="en-CA"/>
+        </w:rPr>
+      </w:pPr>
+      <w:r>
+        <w:rPr>
+          <w:lang w:val="en-CA"/>
+        </w:rPr>
+        <w:t>                ],</w:t>
+      </w:r>
+    </w:p>
+    <w:p>
+      <w:pPr>
+        <w:shd w:val="clear" w:color="auto" w:fill="B4C6E7" w:themeFill="accent1" w:themeFillTint="66"/>
+        <w:spacing w:after="0"/>
+        <w:rPr>
+          <w:lang w:val="en-CA"/>
+        </w:rPr>
+      </w:pPr>
+      <w:r>
+        <w:rPr>
+          <w:lang w:val="en-CA"/>
+        </w:rPr>
+        <w:lastRenderedPageBreak/>
+        <w:t>            },</w:t>
+      </w:r>
+    </w:p>
+    <w:p>
+      <w:pPr>
+        <w:shd w:val="clear" w:color="auto" w:fill="B4C6E7" w:themeFill="accent1" w:themeFillTint="66"/>
+        <w:spacing w:after="0"/>
+        <w:rPr>
+          <w:lang w:val="en-CA"/>
+        </w:rPr>
+      </w:pPr>
+      <w:r>
+        <w:rPr>
+          <w:lang w:val="en-CA"/>
+        </w:rPr>
+        <w:t>            "recurring_messages": {</w:t>
+      </w:r>
+    </w:p>
+    <w:p>
+      <w:pPr>
+        <w:shd w:val="clear" w:color="auto" w:fill="B4C6E7" w:themeFill="accent1" w:themeFillTint="66"/>
+        <w:spacing w:after="0"/>
+        <w:rPr>
+          <w:lang w:val="en-CA"/>
+        </w:rPr>
+      </w:pPr>
+      <w:r>
+        <w:rPr>
+          <w:lang w:val="en-CA"/>
+        </w:rPr>
+        <w:t>                "title": "Recurring educational messages (informational only)",</w:t>
+      </w:r>
+    </w:p>
+    <w:p>
+      <w:pPr>
+        <w:shd w:val="clear" w:color="auto" w:fill="B4C6E7" w:themeFill="accent1" w:themeFillTint="66"/>
+        <w:spacing w:after="0"/>
+        <w:rPr>
+          <w:lang w:val="en-CA"/>
+        </w:rPr>
+      </w:pPr>
+      <w:r>
+        <w:rPr>
+          <w:lang w:val="en-CA"/>
+        </w:rPr>
+        <w:t>                "messages": [</w:t>
+      </w:r>
+    </w:p>
+    <w:p>
+      <w:pPr>
+        <w:shd w:val="clear" w:color="auto" w:fill="B4C6E7" w:themeFill="accent1" w:themeFillTint="66"/>
+        <w:spacing w:after="0"/>
+        <w:rPr>
+          <w:lang w:val="en-CA"/>
+        </w:rPr>
+      </w:pPr>
+      <w:r>
+        <w:rPr>
+          <w:lang w:val="en-CA"/>
+        </w:rPr>
+        <w:t>                    "There is no universal solution",</w:t>
+      </w:r>
+    </w:p>
+    <w:p>
+      <w:pPr>
+        <w:shd w:val="clear" w:color="auto" w:fill="B4C6E7" w:themeFill="accent1" w:themeFillTint="66"/>
+        <w:spacing w:after="0"/>
+        <w:rPr>
+          <w:lang w:val="en-CA"/>
+        </w:rPr>
+      </w:pPr>
+      <w:r>
+        <w:rPr>
+          <w:lang w:val="en-CA"/>
+        </w:rPr>
+        <w:t>                    "Effects depend on context and quantities",</w:t>
+      </w:r>
+    </w:p>
+    <w:p>
+      <w:pPr>
+        <w:shd w:val="clear" w:color="auto" w:fill="B4C6E7" w:themeFill="accent1" w:themeFillTint="66"/>
+        <w:spacing w:after="0"/>
+        <w:rPr>
+          <w:lang w:val="en-CA"/>
+        </w:rPr>
+      </w:pPr>
+      <w:r>
+        <w:rPr>
+          <w:lang w:val="en-CA"/>
+        </w:rPr>
+        <w:t>                    "Nutrition is part of a holistic approach",</w:t>
+      </w:r>
+    </w:p>
+    <w:p>
+      <w:pPr>
+        <w:shd w:val="clear" w:color="auto" w:fill="B4C6E7" w:themeFill="accent1" w:themeFillTint="66"/>
+        <w:spacing w:after="0"/>
+        <w:rPr>
+          <w:lang w:val="en-CA"/>
+        </w:rPr>
+      </w:pPr>
+      <w:r>
+        <w:rPr>
+          <w:lang w:val="en-CA"/>
+        </w:rPr>
+        <w:t>                    "Diet, sleep, and physical activity are interrelated",</w:t>
+      </w:r>
+    </w:p>
+    <w:p>
+      <w:pPr>
+        <w:shd w:val="clear" w:color="auto" w:fill="B4C6E7" w:themeFill="accent1" w:themeFillTint="66"/>
+        <w:spacing w:after="0"/>
+        <w:rPr>
+          <w:lang w:val="en-CA"/>
+        </w:rPr>
+      </w:pPr>
+      <w:r>
+        <w:rPr>
+          <w:lang w:val="en-CA"/>
+        </w:rPr>
+        <w:t>                ],</w:t>
+      </w:r>
+    </w:p>
+    <w:p>
+      <w:pPr>
+        <w:shd w:val="clear" w:color="auto" w:fill="B4C6E7" w:themeFill="accent1" w:themeFillTint="66"/>
+        <w:spacing w:after="0"/>
+        <w:rPr>
+          <w:lang w:val="en-CA"/>
+        </w:rPr>
+      </w:pPr>
+      <w:r>
+        <w:rPr>
+          <w:lang w:val="en-CA"/>
+        </w:rPr>
+        <w:t>            },</w:t>
+      </w:r>
+    </w:p>
+    <w:p>
+      <w:pPr>
+        <w:shd w:val="clear" w:color="auto" w:fill="B4C6E7" w:themeFill="accent1" w:themeFillTint="66"/>
+        <w:spacing w:after="0"/>
+        <w:rPr>
+          <w:lang w:val="en-CA"/>
+        </w:rPr>
+      </w:pPr>
+      <w:r>
+        <w:rPr>
+          <w:lang w:val="en-CA"/>
+        </w:rPr>
+        <w:t>        },</w:t>
+      </w:r>
+    </w:p>
+    <w:p>
+      <w:pPr>
+        <w:shd w:val="clear" w:color="auto" w:fill="B4C6E7" w:themeFill="accent1" w:themeFillTint="66"/>
+        <w:spacing w:after="0"/>
+        <w:rPr>
+          <w:lang w:val="en-CA"/>
+        </w:rPr>
+      </w:pPr>
+      <w:r>
+        <w:rPr>
+          <w:lang w:val="en-CA"/>
+        </w:rPr>
+        <w:t>        "absolute_rules": {</w:t>
+      </w:r>
+    </w:p>
+    <w:p>
+      <w:pPr>
+        <w:shd w:val="clear" w:color="auto" w:fill="B4C6E7" w:themeFill="accent1" w:themeFillTint="66"/>
+        <w:spacing w:after="0"/>
+        <w:rPr>
+          <w:lang w:val="en-CA"/>
+        </w:rPr>
+      </w:pPr>
+      <w:r>
+        <w:rPr>
+          <w:lang w:val="en-CA"/>
+        </w:rPr>
+        <w:t>            "title": "ABSOLUTE RULES (NON-NEGOTIABLE)",</w:t>
+      </w:r>
+    </w:p>
+    <w:p>
+      <w:pPr>
+        <w:shd w:val="clear" w:color="auto" w:fill="B4C6E7" w:themeFill="accent1" w:themeFillTint="66"/>
+        <w:spacing w:after="0"/>
+        <w:rPr>
+          <w:lang w:val="en-CA"/>
+        </w:rPr>
+      </w:pPr>
+      <w:r>
+        <w:rPr>
+          <w:lang w:val="en-CA"/>
+        </w:rPr>
+        <w:t>            "rules": [</w:t>
+      </w:r>
+    </w:p>
+    <w:p>
+      <w:pPr>
+        <w:shd w:val="clear" w:color="auto" w:fill="B4C6E7" w:themeFill="accent1" w:themeFillTint="66"/>
+        <w:spacing w:after="0"/>
+        <w:rPr>
+          <w:lang w:val="en-CA"/>
+        </w:rPr>
+      </w:pPr>
+      <w:r>
+        <w:rPr>
+          <w:lang w:val="en-CA"/>
+        </w:rPr>
+        <w:t>                "Answer ONLY questions related to health and nutrition. For any other questions, politely indicate that you cannot answer on this topic",</w:t>
+      </w:r>
+    </w:p>
+    <w:p>
+      <w:pPr>
+        <w:shd w:val="clear" w:color="auto" w:fill="B4C6E7" w:themeFill="accent1" w:themeFillTint="66"/>
+        <w:spacing w:after="0"/>
+        <w:rPr>
+          <w:lang w:val="en-CA"/>
+        </w:rPr>
+      </w:pPr>
+      <w:r>
+        <w:rPr>
+          <w:lang w:val="en-CA"/>
+        </w:rPr>
+        <w:t>                "Generate a short and clear response",</w:t>
+      </w:r>
+    </w:p>
+    <w:p>
+      <w:pPr>
+        <w:shd w:val="clear" w:color="auto" w:fill="B4C6E7" w:themeFill="accent1" w:themeFillTint="66"/>
+        <w:spacing w:after="0"/>
+        <w:rPr>
+          <w:lang w:val="en-CA"/>
+        </w:rPr>
+      </w:pPr>
+      <w:r>
+        <w:rPr>
+          <w:lang w:val="en-CA"/>
+        </w:rPr>
+        <w:t>                "Use ONLY information present in the provided context",</w:t>
+      </w:r>
+    </w:p>
+    <w:p>
+      <w:pPr>
+        <w:shd w:val="clear" w:color="auto" w:fill="B4C6E7" w:themeFill="accent1" w:themeFillTint="66"/>
+        <w:spacing w:after="0"/>
+        <w:rPr>
+          <w:lang w:val="en-CA"/>
+        </w:rPr>
+      </w:pPr>
+      <w:r>
+        <w:rPr>
+          <w:lang w:val="en-CA"/>
+        </w:rPr>
+        <w:t>                "If information is not in the context, indicate that you cannot answer",</w:t>
+      </w:r>
+    </w:p>
+    <w:p>
+      <w:pPr>
+        <w:shd w:val="clear" w:color="auto" w:fill="B4C6E7" w:themeFill="accent1" w:themeFillTint="66"/>
+        <w:spacing w:after="0"/>
+        <w:rPr>
+          <w:lang w:val="en-CA"/>
+        </w:rPr>
+      </w:pPr>
+      <w:r>
+        <w:rPr>
+          <w:lang w:val="en-CA"/>
+        </w:rPr>
+        <w:t>                "NEVER diagnose",</w:t>
+      </w:r>
+    </w:p>
+    <w:p>
+      <w:pPr>
+        <w:shd w:val="clear" w:color="auto" w:fill="B4C6E7" w:themeFill="accent1" w:themeFillTint="66"/>
+        <w:spacing w:after="0"/>
+        <w:rPr>
+          <w:lang w:val="en-CA"/>
+        </w:rPr>
+      </w:pPr>
+      <w:r>
+        <w:rPr>
+          <w:lang w:val="en-CA"/>
+        </w:rPr>
+        <w:t>                "NEVER provide personalized recommendations",</w:t>
+      </w:r>
+    </w:p>
+    <w:p>
+      <w:pPr>
+        <w:shd w:val="clear" w:color="auto" w:fill="B4C6E7" w:themeFill="accent1" w:themeFillTint="66"/>
+        <w:spacing w:after="0"/>
+        <w:rPr>
+          <w:lang w:val="en-CA"/>
+        </w:rPr>
+      </w:pPr>
+      <w:r>
+        <w:rPr>
+          <w:lang w:val="en-CA"/>
+        </w:rPr>
+        <w:t>                "NEVER recommend medications, supplements, or dosages",</w:t>
+      </w:r>
+    </w:p>
+    <w:p>
+      <w:pPr>
+        <w:shd w:val="clear" w:color="auto" w:fill="B4C6E7" w:themeFill="accent1" w:themeFillTint="66"/>
+        <w:spacing w:after="0"/>
+        <w:rPr>
+          <w:lang w:val="en-CA"/>
+        </w:rPr>
+      </w:pPr>
+      <w:r>
+        <w:rPr>
+          <w:lang w:val="en-CA"/>
+        </w:rPr>
+        <w:t>                "NEVER suggest an individualized meal plan",</w:t>
+      </w:r>
+    </w:p>
+    <w:p>
+      <w:pPr>
+        <w:shd w:val="clear" w:color="auto" w:fill="B4C6E7" w:themeFill="accent1" w:themeFillTint="66"/>
+        <w:spacing w:after="0"/>
+        <w:rPr>
+          <w:lang w:val="en-CA"/>
+        </w:rPr>
+      </w:pPr>
+      <w:r>
+        <w:rPr>
+          <w:lang w:val="en-CA"/>
+        </w:rPr>
+        <w:t>                "For any medical, clinical, or personal question: clearly redirect to a qualified health professional",</w:t>
+      </w:r>
+    </w:p>
+    <w:p>
+      <w:pPr>
+        <w:shd w:val="clear" w:color="auto" w:fill="B4C6E7" w:themeFill="accent1" w:themeFillTint="66"/>
+        <w:spacing w:after="0"/>
+        <w:rPr>
+          <w:lang w:val="en-CA"/>
+        </w:rPr>
+      </w:pPr>
+      <w:r>
+        <w:rPr>
+          <w:lang w:val="en-CA"/>
+        </w:rPr>
+        <w:t>            ],</w:t>
+      </w:r>
+    </w:p>
+    <w:p>
+      <w:pPr>
+        <w:shd w:val="clear" w:color="auto" w:fill="B4C6E7" w:themeFill="accent1" w:themeFillTint="66"/>
+        <w:spacing w:after="0"/>
+        <w:rPr>
+          <w:lang w:val="en-CA"/>
+        </w:rPr>
+      </w:pPr>
+      <w:r>
+        <w:rPr>
+          <w:lang w:val="en-CA"/>
+        </w:rPr>
+        <w:t>        },</w:t>
+      </w:r>
+    </w:p>
+    <w:p>
+      <w:pPr>
+        <w:shd w:val="clear" w:color="auto" w:fill="B4C6E7" w:themeFill="accent1" w:themeFillTint="66"/>
+        <w:spacing w:after="0"/>
+        <w:rPr>
+          <w:lang w:val="en-CA"/>
+        </w:rPr>
+      </w:pPr>
+      <w:r>
+        <w:rPr>
+          <w:lang w:val="en-CA"/>
+        </w:rPr>
+        <w:t>        "behavioral_constraints": {</w:t>
+      </w:r>
+    </w:p>
+    <w:p>
+      <w:pPr>
+        <w:shd w:val="clear" w:color="auto" w:fill="B4C6E7" w:themeFill="accent1" w:themeFillTint="66"/>
+        <w:spacing w:after="0"/>
+        <w:rPr>
+          <w:lang w:val="en-CA"/>
+        </w:rPr>
+      </w:pPr>
+      <w:r>
+        <w:rPr>
+          <w:lang w:val="en-CA"/>
+        </w:rPr>
+        <w:t>            "title": "BEHAVIORAL GUIDELINES",</w:t>
+      </w:r>
+    </w:p>
+    <w:p>
+      <w:pPr>
+        <w:shd w:val="clear" w:color="auto" w:fill="B4C6E7" w:themeFill="accent1" w:themeFillTint="66"/>
+        <w:spacing w:after="0"/>
+        <w:rPr>
+          <w:lang w:val="en-CA"/>
+        </w:rPr>
+      </w:pPr>
+      <w:r>
+        <w:rPr>
+          <w:lang w:val="en-CA"/>
+        </w:rPr>
+        <w:t>            "constraints": [</w:t>
+      </w:r>
+    </w:p>
+    <w:p>
+      <w:pPr>
+        <w:shd w:val="clear" w:color="auto" w:fill="B4C6E7" w:themeFill="accent1" w:themeFillTint="66"/>
+        <w:spacing w:after="0"/>
+        <w:rPr>
+          <w:lang w:val="en-CA"/>
+        </w:rPr>
+      </w:pPr>
+      <w:r>
+        <w:rPr>
+          <w:lang w:val="en-CA"/>
+        </w:rPr>
+        <w:lastRenderedPageBreak/>
+        <w:t>                "Provide only general information for educational purposes",</w:t>
+      </w:r>
+    </w:p>
+    <w:p>
+      <w:pPr>
+        <w:shd w:val="clear" w:color="auto" w:fill="B4C6E7" w:themeFill="accent1" w:themeFillTint="66"/>
+        <w:spacing w:after="0"/>
+        <w:rPr>
+          <w:lang w:val="en-CA"/>
+        </w:rPr>
+      </w:pPr>
+      <w:r>
+        <w:rPr>
+          <w:lang w:val="en-CA"/>
+        </w:rPr>
+        <w:t>                "Avoid wording that could influence a personal health decision",</w:t>
+      </w:r>
+    </w:p>
+    <w:p>
+      <w:pPr>
+        <w:shd w:val="clear" w:color="auto" w:fill="B4C6E7" w:themeFill="accent1" w:themeFillTint="66"/>
+        <w:spacing w:after="0"/>
+        <w:rPr>
+          <w:lang w:val="en-CA"/>
+        </w:rPr>
+      </w:pPr>
+      <w:r>
+        <w:rPr>
+          <w:lang w:val="en-CA"/>
+        </w:rPr>
+        <w:t>                "Do not create follow-up or continuity relationships",</w:t>
+      </w:r>
+    </w:p>
+    <w:p>
+      <w:pPr>
+        <w:shd w:val="clear" w:color="auto" w:fill="B4C6E7" w:themeFill="accent1" w:themeFillTint="66"/>
+        <w:spacing w:after="0"/>
+        <w:rPr>
+          <w:lang w:val="en-CA"/>
+        </w:rPr>
+      </w:pPr>
+      <w:r>
+        <w:rPr>
+          <w:lang w:val="en-CA"/>
+        </w:rPr>
+        <w:t>                "Use conversation history only for coherence, never to personalize health advice",</w:t>
+      </w:r>
+    </w:p>
+    <w:p>
+      <w:pPr>
+        <w:shd w:val="clear" w:color="auto" w:fill="B4C6E7" w:themeFill="accent1" w:themeFillTint="66"/>
+        <w:spacing w:after="0"/>
+      </w:pPr>
+      <w:r>
+        <w:rPr>
+          <w:lang w:val="en-CA"/>
+        </w:rPr>
+        <w:t xml:space="preserve">            </w:t>
+      </w:r>
+      <w:r>
+        <w:t>],</w:t>
+      </w:r>
+    </w:p>
+    <w:p>
+      <w:pPr>
+        <w:shd w:val="clear" w:color="auto" w:fill="B4C6E7" w:themeFill="accent1" w:themeFillTint="66"/>
+        <w:spacing w:after="0"/>
+      </w:pPr>
+      <w:r>
+        <w:t>        },</w:t>
+      </w:r>
+    </w:p>
+    <w:p>
+      <w:pPr>
+        <w:shd w:val="clear" w:color="auto" w:fill="B4C6E7" w:themeFill="accent1" w:themeFillTint="66"/>
+        <w:spacing w:after="0"/>
+      </w:pPr>
+      <w:r>
+        <w:t>        "format_constraints": {</w:t>
+      </w:r>
+    </w:p>
+    <w:p>
+      <w:pPr>
+        <w:shd w:val="clear" w:color="auto" w:fill="B4C6E7" w:themeFill="accent1" w:themeFillTint="66"/>
+        <w:spacing w:after="0"/>
+      </w:pPr>
+      <w:r>
+        <w:t>            "title": "FORMAT CONSTRAINTS",</w:t>
+      </w:r>
+    </w:p>
+    <w:p>
+      <w:pPr>
+        <w:shd w:val="clear" w:color="auto" w:fill="B4C6E7" w:themeFill="accent1" w:themeFillTint="66"/>
+        <w:spacing w:after="0"/>
+        <w:rPr>
+          <w:lang w:val="en-CA"/>
+        </w:rPr>
+      </w:pPr>
+      <w:r>
+        <w:t xml:space="preserve">            </w:t>
+      </w:r>
+      <w:r>
+        <w:rPr>
+          <w:lang w:val="en-CA"/>
+        </w:rPr>
+        <w:t>"rules": [</w:t>
+      </w:r>
+    </w:p>
+    <w:p>
+      <w:pPr>
+        <w:shd w:val="clear" w:color="auto" w:fill="B4C6E7" w:themeFill="accent1" w:themeFillTint="66"/>
+        <w:spacing w:after="0"/>
+        <w:rPr>
+          <w:lang w:val="en-CA"/>
+        </w:rPr>
+      </w:pPr>
+      <w:r>
+        <w:rPr>
+          <w:lang w:val="en-CA"/>
+        </w:rPr>
+        <w:t>                "Return the final answer in clean, readable Markdown",</w:t>
+      </w:r>
+    </w:p>
+    <w:p>
+      <w:pPr>
+        <w:shd w:val="clear" w:color="auto" w:fill="B4C6E7" w:themeFill="accent1" w:themeFillTint="66"/>
+        <w:spacing w:after="0"/>
+        <w:rPr>
+          <w:lang w:val="en-CA"/>
+        </w:rPr>
+      </w:pPr>
+      <w:r>
+        <w:rPr>
+          <w:lang w:val="en-CA"/>
+        </w:rPr>
+        <w:t>                "Use short sections with explicit headings when useful",</w:t>
+      </w:r>
+    </w:p>
+    <w:p>
+      <w:pPr>
+        <w:shd w:val="clear" w:color="auto" w:fill="B4C6E7" w:themeFill="accent1" w:themeFillTint="66"/>
+        <w:spacing w:after="0"/>
+        <w:rPr>
+          <w:lang w:val="en-CA"/>
+        </w:rPr>
+      </w:pPr>
+      <w:r>
+        <w:rPr>
+          <w:lang w:val="en-CA"/>
+        </w:rPr>
+        <w:t>                "Use bullet points for lists or key takeaways",</w:t>
+      </w:r>
+    </w:p>
+    <w:p>
+      <w:pPr>
+        <w:shd w:val="clear" w:color="auto" w:fill="B4C6E7" w:themeFill="accent1" w:themeFillTint="66"/>
+        <w:spacing w:after="0"/>
+        <w:rPr>
+          <w:lang w:val="en-CA"/>
+        </w:rPr>
+      </w:pPr>
+      <w:r>
+        <w:rPr>
+          <w:lang w:val="en-CA"/>
+        </w:rPr>
+        <w:t>                "Highlight key facts clearly",</w:t>
+      </w:r>
+    </w:p>
+    <w:p>
+      <w:pPr>
+        <w:shd w:val="clear" w:color="auto" w:fill="B4C6E7" w:themeFill="accent1" w:themeFillTint="66"/>
+        <w:spacing w:after="0"/>
+        <w:rPr>
+          <w:lang w:val="en-CA"/>
+        </w:rPr>
+      </w:pPr>
+      <w:r>
+        <w:rPr>
+          <w:lang w:val="en-CA"/>
+        </w:rPr>
+        <w:t>            ],</w:t>
+      </w:r>
+    </w:p>
+    <w:p>
+      <w:pPr>
+        <w:shd w:val="clear" w:color="auto" w:fill="B4C6E7" w:themeFill="accent1" w:themeFillTint="66"/>
+        <w:spacing w:after="0"/>
+        <w:rPr>
+          <w:lang w:val="en-CA"/>
+        </w:rPr>
+      </w:pPr>
+      <w:r>
+        <w:rPr>
+          <w:lang w:val="en-CA"/>
+        </w:rPr>
+        <w:t>        }</w:t>
+      </w:r>
+    </w:p>
+    <w:p>
+      <w:pPr>
+        <w:rPr>
+          <w:lang w:val="en-CA"/>
+        </w:rPr>
+      </w:pPr>
+    </w:p>
+    <w:p>
+      <w:pPr>
+        <w:spacing w:line="480" w:lineRule="auto"/>
+        <w:rPr>
+          <w:b/>
+          <w:bCs/>
+          <w:sz w:val="28"/>
+          <w:szCs w:val="28"/>
+          <w:lang w:val="en-CA"/>
+        </w:rPr>
+      </w:pPr>
+      <w:r>
+        <w:rPr>
+          <w:lang w:val="en-CA"/>
+        </w:rPr>
+        <w:br w:type="page"/>
       </w:r>
     </w:p>
     <w:p>
       <w:pPr>
         <w:pStyle w:val="En-tte1"/>
       </w:pPr>
+      <w:r>
+        <w:lastRenderedPageBreak/>
+        <w:t>Liste des avertissements</w:t>
+      </w:r>
+      <w:r>
+        <w:t xml:space="preserve"> et politique de confidentialité</w:t>
+      </w:r>
+    </w:p>
+    <w:p>
+      <w:pPr>
+        <w:rPr>
+          <w:noProof/>
+        </w:rPr>
+      </w:pPr>
+      <w:r>
+        <w:rPr>
+          <w:noProof/>
+        </w:rPr>
+        <w:t>Des avertissements ainsi qu’une politique de confidentialité devront nécessairement être ajoutés à l’interface du site Web de NutriFAQ</w:t>
+      </w:r>
+      <w:r>
+        <w:rPr>
+          <w:noProof/>
+        </w:rPr>
+        <w:t>-Chat</w:t>
+      </w:r>
+      <w:r>
+        <w:rPr>
+          <w:noProof/>
+        </w:rPr>
+        <w:t>. Voici quelques exemples d’avertissements.</w:t>
+      </w:r>
+    </w:p>
+    <w:p>
       <w:r>
         <w:rPr>
           <w:noProof/>
@@ -1645,13 +1581,86 @@
         <mc:AlternateContent>
           <mc:Choice Requires="wps">
             <w:drawing>
-              <wp:anchor distT="0" distB="0" distL="114300" distR="114300" simplePos="0" relativeHeight="251660288" behindDoc="0" locked="0" layoutInCell="1" allowOverlap="1" wp14:anchorId="08398CA2" wp14:editId="03D92A7A">
+              <wp:anchor distT="0" distB="0" distL="114300" distR="114300" simplePos="0" relativeHeight="251659264" behindDoc="0" locked="0" layoutInCell="1" allowOverlap="1" wp14:anchorId="238C1E15" wp14:editId="0C813D42">
                 <wp:simplePos x="0" y="0"/>
                 <wp:positionH relativeFrom="column">
-                  <wp:posOffset>3474720</wp:posOffset>
+                  <wp:posOffset>3558981</wp:posOffset>
                 </wp:positionH>
                 <wp:positionV relativeFrom="paragraph">
-                  <wp:posOffset>2868905</wp:posOffset>
+                  <wp:posOffset>2431525</wp:posOffset>
+                </wp:positionV>
+                <wp:extent cx="577901" cy="212141"/>
+                <wp:effectExtent l="38100" t="0" r="31750" b="73660"/>
+                <wp:wrapNone/>
+                <wp:docPr id="1252396041" name="Connecteur droit avec flèche 1"/>
+                <wp:cNvGraphicFramePr/>
+                <a:graphic xmlns:a="http://schemas.openxmlformats.org/drawingml/2006/main">
+                  <a:graphicData uri="http://schemas.microsoft.com/office/word/2010/wordprocessingShape">
+                    <wps:wsp>
+                      <wps:cNvCnPr/>
+                      <wps:spPr>
+                        <a:xfrm flipH="1">
+                          <a:off x="0" y="0"/>
+                          <a:ext cx="577901" cy="212141"/>
+                        </a:xfrm>
+                        <a:prstGeom prst="straightConnector1">
+                          <a:avLst/>
+                        </a:prstGeom>
+                        <a:ln>
+                          <a:solidFill>
+                            <a:srgbClr val="EE0000"/>
+                          </a:solidFill>
+                          <a:tailEnd type="triangle"/>
+                        </a:ln>
+                      </wps:spPr>
+                      <wps:style>
+                        <a:lnRef idx="3">
+                          <a:schemeClr val="accent2"/>
+                        </a:lnRef>
+                        <a:fillRef idx="0">
+                          <a:schemeClr val="accent2"/>
+                        </a:fillRef>
+                        <a:effectRef idx="2">
+                          <a:schemeClr val="accent2"/>
+                        </a:effectRef>
+                        <a:fontRef idx="minor">
+                          <a:schemeClr val="tx1"/>
+                        </a:fontRef>
+                      </wps:style>
+                      <wps:bodyPr/>
+                    </wps:wsp>
+                  </a:graphicData>
+                </a:graphic>
+              </wp:anchor>
+            </w:drawing>
+          </mc:Choice>
+          <mc:Fallback>
+            <w:pict>
+              <v:shapetype w14:anchorId="00B0E2A5" id="_x0000_t32" coordsize="21600,21600" o:spt="32" o:oned="t" path="m,l21600,21600e" filled="f">
+                <v:path arrowok="t" fillok="f" o:connecttype="none"/>
+                <o:lock v:ext="edit" shapetype="t"/>
+              </v:shapetype>
+              <v:shape id="Connecteur droit avec flèche 1" o:spid="_x0000_s1026" type="#_x0000_t32" style="position:absolute;margin-left:280.25pt;margin-top:191.45pt;width:45.5pt;height:16.7pt;flip:x;z-index:251659264;visibility:visible;mso-wrap-style:square;mso-wrap-distance-left:9pt;mso-wrap-distance-top:0;mso-wrap-distance-right:9pt;mso-wrap-distance-bottom:0;mso-position-horizontal:absolute;mso-position-horizontal-relative:text;mso-position-vertical:absolute;mso-position-vertical-relative:text" o:gfxdata="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" strokecolor="#e00" strokeweight="1.5pt">
+                <v:stroke endarrow="block" joinstyle="miter"/>
+              </v:shape>
+            </w:pict>
+          </mc:Fallback>
+        </mc:AlternateContent>
+      </w:r>
+      <w:r>
+        <w:rPr>
+          <w:noProof/>
+        </w:rPr>
+        <mc:AlternateContent>
+          <mc:Choice Requires="wps">
+            <w:drawing>
+              <wp:anchor distT="0" distB="0" distL="114300" distR="114300" simplePos="0" relativeHeight="251660288" behindDoc="0" locked="0" layoutInCell="1" allowOverlap="1" wp14:anchorId="08398CA2" wp14:editId="5F41F023">
+                <wp:simplePos x="0" y="0"/>
+                <wp:positionH relativeFrom="column">
+                  <wp:posOffset>3657158</wp:posOffset>
+                </wp:positionH>
+                <wp:positionV relativeFrom="paragraph">
+                  <wp:posOffset>4079406</wp:posOffset>
                 </wp:positionV>
                 <wp:extent cx="387706" cy="241401"/>
                 <wp:effectExtent l="38100" t="0" r="31750" b="63500"/>
@@ -1703,11 +1712,7 @@
           </mc:Choice>
           <mc:Fallback>
             <w:pict>
-              <v:shapetype w14:anchorId="43E0E4F6" id="_x0000_t32" coordsize="21600,21600" o:spt="32" o:oned="t" path="m,l21600,21600e" filled="f">
-                <v:path arrowok="t" fillok="f" o:connecttype="none"/>
-                <o:lock v:ext="edit" shapetype="t"/>
-              </v:shapetype>
-              <v:shape id="Connecteur droit avec flèche 2" o:spid="_x0000_s1026" type="#_x0000_t32" style="position:absolute;margin-left:273.6pt;margin-top:225.9pt;width:30.55pt;height:19pt;flip:x;z-index:251660288;visibility:visible;mso-wrap-style:square;mso-wrap-distance-left:9pt;mso-wrap-distance-top:0;mso-wrap-distance-right:9pt;mso-wrap-distance-bottom:0;mso-position-horizontal:absolute;mso-position-horizontal-relative:text;mso-position-vertical:absolute;mso-position-vertical-relative:text" o:gfxdata="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" strokecolor="#e00" strokeweight="1.5pt">
+              <v:shape w14:anchorId="6627E970" id="Connecteur droit avec flèche 2" o:spid="_x0000_s1026" type="#_x0000_t32" style="position:absolute;margin-left:287.95pt;margin-top:321.2pt;width:30.55pt;height:19pt;flip:x;z-index:251660288;visibility:visible;mso-wrap-style:square;mso-wrap-distance-left:9pt;mso-wrap-distance-top:0;mso-wrap-distance-right:9pt;mso-wrap-distance-bottom:0;mso-position-horizontal:absolute;mso-position-horizontal-relative:text;mso-position-vertical:absolute;mso-position-vertical-relative:text" o:gfxdata="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" strokecolor="#e00" strokeweight="1.5pt">
                 <v:stroke endarrow="open"/>
               </v:shape>
             </w:pict>
@@ -1718,80 +1723,14 @@
         <w:rPr>
           <w:noProof/>
         </w:rPr>
-        <mc:AlternateContent>
-          <mc:Choice Requires="wps">
-            <w:drawing>
-              <wp:anchor distT="0" distB="0" distL="114300" distR="114300" simplePos="0" relativeHeight="251659264" behindDoc="0" locked="0" layoutInCell="1" allowOverlap="1" wp14:anchorId="238C1E15" wp14:editId="4BD7AD95">
-                <wp:simplePos x="0" y="0"/>
-                <wp:positionH relativeFrom="column">
-                  <wp:posOffset>3869741</wp:posOffset>
-                </wp:positionH>
-                <wp:positionV relativeFrom="paragraph">
-                  <wp:posOffset>1340028</wp:posOffset>
-                </wp:positionV>
-                <wp:extent cx="577901" cy="212141"/>
-                <wp:effectExtent l="38100" t="0" r="31750" b="73660"/>
-                <wp:wrapNone/>
-                <wp:docPr id="1252396041" name="Connecteur droit avec flèche 1"/>
-                <wp:cNvGraphicFramePr/>
-                <a:graphic xmlns:a="http://schemas.openxmlformats.org/drawingml/2006/main">
-                  <a:graphicData uri="http://schemas.microsoft.com/office/word/2010/wordprocessingShape">
-                    <wps:wsp>
-                      <wps:cNvCnPr/>
-                      <wps:spPr>
-                        <a:xfrm flipH="1">
-                          <a:off x="0" y="0"/>
-                          <a:ext cx="577901" cy="212141"/>
-                        </a:xfrm>
-                        <a:prstGeom prst="straightConnector1">
-                          <a:avLst/>
-                        </a:prstGeom>
-                        <a:ln>
-                          <a:solidFill>
-                            <a:srgbClr val="EE0000"/>
-                          </a:solidFill>
-                          <a:tailEnd type="triangle"/>
-                        </a:ln>
-                      </wps:spPr>
-                      <wps:style>
-                        <a:lnRef idx="3">
-                          <a:schemeClr val="accent2"/>
-                        </a:lnRef>
-                        <a:fillRef idx="0">
-                          <a:schemeClr val="accent2"/>
-                        </a:fillRef>
-                        <a:effectRef idx="2">
-                          <a:schemeClr val="accent2"/>
-                        </a:effectRef>
-                        <a:fontRef idx="minor">
-                          <a:schemeClr val="tx1"/>
-                        </a:fontRef>
-                      </wps:style>
-                      <wps:bodyPr/>
-                    </wps:wsp>
-                  </a:graphicData>
-                </a:graphic>
-              </wp:anchor>
-            </w:drawing>
-          </mc:Choice>
-          <mc:Fallback>
-            <w:pict>
-              <v:shape w14:anchorId="7C9080BA" id="Connecteur droit avec flèche 1" o:spid="_x0000_s1026" type="#_x0000_t32" style="position:absolute;margin-left:304.7pt;margin-top:105.5pt;width:45.5pt;height:16.7pt;flip:x;z-index:251659264;visibility:visible;mso-wrap-style:square;mso-wrap-distance-left:9pt;mso-wrap-distance-top:0;mso-wrap-distance-right:9pt;mso-wrap-distance-bottom:0;mso-position-horizontal:absolute;mso-position-horizontal-relative:text;mso-position-vertical:absolute;mso-position-vertical-relative:text" o:gfxdata="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" strokecolor="#e00" strokeweight="1.5pt">
-                <v:stroke endarrow="block" joinstyle="miter"/>
-              </v:shape>
-            </w:pict>
-          </mc:Fallback>
-        </mc:AlternateContent>
-      </w:r>
-      <w:r>
-        <w:rPr>
-          <w:noProof/>
-        </w:rPr>
+        <w:t xml:space="preserve"> </w:t>
+      </w:r>
+      <w:r>
         <w:drawing>
-          <wp:inline distT="0" distB="0" distL="0" distR="0" wp14:anchorId="513DA1B9" wp14:editId="62CFB954">
-            <wp:extent cx="5943600" cy="3210560"/>
-            <wp:effectExtent l="0" t="0" r="0" b="8890"/>
-            <wp:docPr id="1609653124" name="Image 1"/>
+          <wp:inline distT="0" distB="0" distL="0" distR="0" wp14:anchorId="21A782CE" wp14:editId="7E8EE5FD">
+            <wp:extent cx="5943600" cy="4270375"/>
+            <wp:effectExtent l="0" t="0" r="0" b="0"/>
+            <wp:docPr id="1579263318" name="Image 1"/>
             <wp:cNvGraphicFramePr>
               <a:graphicFrameLocks xmlns:a="http://schemas.openxmlformats.org/drawingml/2006/main" noChangeAspect="1"/>
             </wp:cNvGraphicFramePr>
@@ -1799,11 +1738,11 @@
               <a:graphicData uri="http://schemas.openxmlformats.org/drawingml/2006/picture">
                 <pic:pic xmlns:pic="http://schemas.openxmlformats.org/drawingml/2006/picture">
                   <pic:nvPicPr>
-                    <pic:cNvPr id="1609653124" name=""/>
+                    <pic:cNvPr id="1579263318" name=""/>
                     <pic:cNvPicPr/>
                   </pic:nvPicPr>
                   <pic:blipFill>
-                    <a:blip r:embed="rId12"/>
+                    <a:blip r:embed="rId7"/>
                     <a:stretch>
                       <a:fillRect/>
                     </a:stretch>
@@ -1811,7 +1750,7 @@
                   <pic:spPr>
                     <a:xfrm>
                       <a:off x="0" y="0"/>
-                      <a:ext cx="5943600" cy="3210560"/>
+                      <a:ext cx="5943600" cy="4270375"/>
                     </a:xfrm>
                     <a:prstGeom prst="rect">
                       <a:avLst/>
@@ -1827,98 +1766,15 @@
     <w:p>
       <w:pPr>
         <w:pStyle w:val="En-tte1"/>
-      </w:pPr>
-      <w:r>
-        <w:rPr>
-          <w:noProof/>
-        </w:rPr>
-        <mc:AlternateContent>
-          <mc:Choice Requires="wps">
-            <w:drawing>
-              <wp:anchor distT="0" distB="0" distL="114300" distR="114300" simplePos="0" relativeHeight="251661312" behindDoc="0" locked="0" layoutInCell="1" allowOverlap="1" wp14:anchorId="53BA59DC" wp14:editId="2EC1AEB2">
-                <wp:simplePos x="0" y="0"/>
-                <wp:positionH relativeFrom="column">
-                  <wp:posOffset>1469974</wp:posOffset>
-                </wp:positionH>
-                <wp:positionV relativeFrom="paragraph">
-                  <wp:posOffset>2751988</wp:posOffset>
-                </wp:positionV>
-                <wp:extent cx="226771" cy="438912"/>
-                <wp:effectExtent l="38100" t="0" r="20955" b="56515"/>
-                <wp:wrapNone/>
-                <wp:docPr id="91627353" name="Connecteur droit avec flèche 3"/>
-                <wp:cNvGraphicFramePr/>
-                <a:graphic xmlns:a="http://schemas.openxmlformats.org/drawingml/2006/main">
-                  <a:graphicData uri="http://schemas.microsoft.com/office/word/2010/wordprocessingShape">
-                    <wps:wsp>
-                      <wps:cNvCnPr/>
-                      <wps:spPr>
-                        <a:xfrm flipH="1">
-                          <a:off x="0" y="0"/>
-                          <a:ext cx="226771" cy="438912"/>
-                        </a:xfrm>
-                        <a:prstGeom prst="straightConnector1">
-                          <a:avLst/>
-                        </a:prstGeom>
-                        <a:ln w="19050" cap="flat" cmpd="sng" algn="ctr">
-                          <a:solidFill>
-                            <a:schemeClr val="accent2"/>
-                          </a:solidFill>
-                          <a:prstDash val="solid"/>
-                          <a:round/>
-                          <a:headEnd type="none" w="med" len="med"/>
-                          <a:tailEnd type="arrow" w="med" len="med"/>
-                        </a:ln>
-                      </wps:spPr>
-                      <wps:style>
-                        <a:lnRef idx="0">
-                          <a:scrgbClr r="0" g="0" b="0"/>
-                        </a:lnRef>
-                        <a:fillRef idx="0">
-                          <a:scrgbClr r="0" g="0" b="0"/>
-                        </a:fillRef>
-                        <a:effectRef idx="0">
-                          <a:scrgbClr r="0" g="0" b="0"/>
-                        </a:effectRef>
-                        <a:fontRef idx="minor">
-                          <a:schemeClr val="tx1"/>
-                        </a:fontRef>
-                      </wps:style>
-                      <wps:bodyPr/>
-                    </wps:wsp>
-                  </a:graphicData>
-                </a:graphic>
-              </wp:anchor>
-            </w:drawing>
-          </mc:Choice>
-          <mc:Fallback>
-            <w:pict>
-              <v:shapetype w14:anchorId="546A7A15" id="_x0000_t32" coordsize="21600,21600" o:spt="32" o:oned="t" path="m,l21600,21600e" filled="f">
-                <v:path arrowok="t" fillok="f" o:connecttype="none"/>
-                <o:lock v:ext="edit" shapetype="t"/>
-              </v:shapetype>
-              <v:shape id="Connecteur droit avec flèche 3" o:spid="_x0000_s1026" type="#_x0000_t32" style="position:absolute;margin-left:115.75pt;margin-top:216.7pt;width:17.85pt;height:34.55pt;flip:x;z-index:251661312;visibility:visible;mso-wrap-style:square;mso-wrap-distance-left:9pt;mso-wrap-distance-top:0;mso-wrap-distance-right:9pt;mso-wrap-distance-bottom:0;mso-position-horizontal:absolute;mso-position-horizontal-relative:text;mso-position-vertical:absolute;mso-position-vertical-relative:text" o:gfxdata="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" strokecolor="#ed7d31 [3205]" strokeweight="1.5pt">
-                <v:stroke endarrow="open"/>
-              </v:shape>
-            </w:pict>
-          </mc:Fallback>
-        </mc:AlternateContent>
-      </w:r>
-      <w:r>
-        <w:rPr>
-          <w:noProof/>
-        </w:rPr>
-        <w:t xml:space="preserve"> </w:t>
-      </w:r>
-      <w:r>
-        <w:rPr>
-          <w:noProof/>
-        </w:rPr>
+        <w:jc w:val="center"/>
+      </w:pPr>
+      <w:r>
+        <w:lastRenderedPageBreak/>
         <w:drawing>
-          <wp:inline distT="0" distB="0" distL="0" distR="0" wp14:anchorId="0104CC93" wp14:editId="765E2B5C">
-            <wp:extent cx="3979469" cy="3618936"/>
-            <wp:effectExtent l="0" t="0" r="2540" b="635"/>
-            <wp:docPr id="1974829550" name="Image 1"/>
+          <wp:inline distT="0" distB="0" distL="0" distR="0" wp14:anchorId="3636B27D" wp14:editId="64AFCF03">
+            <wp:extent cx="5943600" cy="3707765"/>
+            <wp:effectExtent l="0" t="0" r="0" b="6985"/>
+            <wp:docPr id="631222875" name="Image 1"/>
             <wp:cNvGraphicFramePr>
               <a:graphicFrameLocks xmlns:a="http://schemas.openxmlformats.org/drawingml/2006/main" noChangeAspect="1"/>
             </wp:cNvGraphicFramePr>
@@ -1926,11 +1782,11 @@
               <a:graphicData uri="http://schemas.openxmlformats.org/drawingml/2006/picture">
                 <pic:pic xmlns:pic="http://schemas.openxmlformats.org/drawingml/2006/picture">
                   <pic:nvPicPr>
-                    <pic:cNvPr id="1974829550" name=""/>
+                    <pic:cNvPr id="631222875" name=""/>
                     <pic:cNvPicPr/>
                   </pic:nvPicPr>
                   <pic:blipFill>
-                    <a:blip r:embed="rId13"/>
+                    <a:blip r:embed="rId8"/>
                     <a:stretch>
                       <a:fillRect/>
                     </a:stretch>
@@ -1938,7 +1794,7 @@
                   <pic:spPr>
                     <a:xfrm>
                       <a:off x="0" y="0"/>
-                      <a:ext cx="3988380" cy="3627040"/>
+                      <a:ext cx="5943600" cy="3707765"/>
                     </a:xfrm>
                     <a:prstGeom prst="rect">
                       <a:avLst/>
@@ -1954,17 +1810,15 @@
     <w:p>
       <w:pPr>
         <w:pStyle w:val="En-tte1"/>
-      </w:pPr>
-      <w:r>
-        <w:rPr>
-          <w:noProof/>
-        </w:rPr>
+        <w:jc w:val="center"/>
+      </w:pPr>
+      <w:r>
         <w:lastRenderedPageBreak/>
         <w:drawing>
-          <wp:inline distT="0" distB="0" distL="0" distR="0" wp14:anchorId="75A3E731" wp14:editId="4C86EDD6">
-            <wp:extent cx="4176980" cy="4448855"/>
-            <wp:effectExtent l="0" t="0" r="0" b="8890"/>
-            <wp:docPr id="1878384408" name="Image 1"/>
+          <wp:inline distT="0" distB="0" distL="0" distR="0" wp14:anchorId="11D4EBEC" wp14:editId="141499CE">
+            <wp:extent cx="5943600" cy="6560185"/>
+            <wp:effectExtent l="0" t="0" r="0" b="0"/>
+            <wp:docPr id="23622075" name="Image 1"/>
             <wp:cNvGraphicFramePr>
               <a:graphicFrameLocks xmlns:a="http://schemas.openxmlformats.org/drawingml/2006/main" noChangeAspect="1"/>
             </wp:cNvGraphicFramePr>
@@ -1972,11 +1826,11 @@
               <a:graphicData uri="http://schemas.openxmlformats.org/drawingml/2006/picture">
                 <pic:pic xmlns:pic="http://schemas.openxmlformats.org/drawingml/2006/picture">
                   <pic:nvPicPr>
-                    <pic:cNvPr id="1878384408" name=""/>
+                    <pic:cNvPr id="23622075" name=""/>
                     <pic:cNvPicPr/>
                   </pic:nvPicPr>
                   <pic:blipFill>
-                    <a:blip r:embed="rId14"/>
+                    <a:blip r:embed="rId9"/>
                     <a:stretch>
                       <a:fillRect/>
                     </a:stretch>
@@ -1984,7 +1838,7 @@
                   <pic:spPr>
                     <a:xfrm>
                       <a:off x="0" y="0"/>
-                      <a:ext cx="4185218" cy="4457629"/>
+                      <a:ext cx="5943600" cy="6560185"/>
                     </a:xfrm>
                     <a:prstGeom prst="rect">
                       <a:avLst/>
@@ -2001,95 +1855,14 @@
       <w:pPr>
         <w:pStyle w:val="En-tte1"/>
       </w:pPr>
-      <w:r>
-        <w:rPr>
-          <w:noProof/>
-        </w:rPr>
-        <w:drawing>
-          <wp:inline distT="0" distB="0" distL="0" distR="0" wp14:anchorId="252024F1" wp14:editId="22D03BF9">
-            <wp:extent cx="5186477" cy="3195003"/>
-            <wp:effectExtent l="0" t="0" r="0" b="5715"/>
-            <wp:docPr id="285532422" name="Image 1"/>
-            <wp:cNvGraphicFramePr>
-              <a:graphicFrameLocks xmlns:a="http://schemas.openxmlformats.org/drawingml/2006/main" noChangeAspect="1"/>
-            </wp:cNvGraphicFramePr>
-            <a:graphic xmlns:a="http://schemas.openxmlformats.org/drawingml/2006/main">
-              <a:graphicData uri="http://schemas.openxmlformats.org/drawingml/2006/picture">
-                <pic:pic xmlns:pic="http://schemas.openxmlformats.org/drawingml/2006/picture">
-                  <pic:nvPicPr>
-                    <pic:cNvPr id="285532422" name=""/>
-                    <pic:cNvPicPr/>
-                  </pic:nvPicPr>
-                  <pic:blipFill>
-                    <a:blip r:embed="rId15"/>
-                    <a:stretch>
-                      <a:fillRect/>
-                    </a:stretch>
-                  </pic:blipFill>
-                  <pic:spPr>
-                    <a:xfrm>
-                      <a:off x="0" y="0"/>
-                      <a:ext cx="5200327" cy="3203535"/>
-                    </a:xfrm>
-                    <a:prstGeom prst="rect">
-                      <a:avLst/>
-                    </a:prstGeom>
-                  </pic:spPr>
-                </pic:pic>
-              </a:graphicData>
-            </a:graphic>
-          </wp:inline>
-        </w:drawing>
-      </w:r>
-    </w:p>
-    <w:p>
-      <w:pPr>
-        <w:pStyle w:val="En-tte1"/>
-      </w:pPr>
-      <w:r>
-        <w:rPr>
-          <w:noProof/>
-        </w:rPr>
-        <w:lastRenderedPageBreak/>
-        <w:drawing>
-          <wp:inline distT="0" distB="0" distL="0" distR="0" wp14:anchorId="5BEE4137" wp14:editId="610DB63E">
-            <wp:extent cx="5943600" cy="7166610"/>
-            <wp:effectExtent l="0" t="0" r="0" b="0"/>
-            <wp:docPr id="1814952772" name="Image 1"/>
-            <wp:cNvGraphicFramePr>
-              <a:graphicFrameLocks xmlns:a="http://schemas.openxmlformats.org/drawingml/2006/main" noChangeAspect="1"/>
-            </wp:cNvGraphicFramePr>
-            <a:graphic xmlns:a="http://schemas.openxmlformats.org/drawingml/2006/main">
-              <a:graphicData uri="http://schemas.openxmlformats.org/drawingml/2006/picture">
-                <pic:pic xmlns:pic="http://schemas.openxmlformats.org/drawingml/2006/picture">
-                  <pic:nvPicPr>
-                    <pic:cNvPr id="1814952772" name=""/>
-                    <pic:cNvPicPr/>
-                  </pic:nvPicPr>
-                  <pic:blipFill>
-                    <a:blip r:embed="rId16"/>
-                    <a:stretch>
-                      <a:fillRect/>
-                    </a:stretch>
-                  </pic:blipFill>
-                  <pic:spPr>
-                    <a:xfrm>
-                      <a:off x="0" y="0"/>
-                      <a:ext cx="5943600" cy="7166610"/>
-                    </a:xfrm>
-                    <a:prstGeom prst="rect">
-                      <a:avLst/>
-                    </a:prstGeom>
-                  </pic:spPr>
-                </pic:pic>
-              </a:graphicData>
-            </a:graphic>
-          </wp:inline>
-        </w:drawing>
-      </w:r>
     </w:p>
     <w:sectPr>
-      <w:footerReference w:type="default" r:id="rId17"/>
+      <w:headerReference w:type="even" r:id="rId10"/>
+      <w:headerReference w:type="default" r:id="rId11"/>
+      <w:footerReference w:type="even" r:id="rId12"/>
+      <w:footerReference w:type="default" r:id="rId13"/>
+      <w:headerReference w:type="first" r:id="rId14"/>
+      <w:footerReference w:type="first" r:id="rId15"/>
       <w:pgSz w:w="12240" w:h="15840"/>
       <w:pgMar w:top="1440" w:right="1440" w:bottom="1440" w:left="1440" w:header="708" w:footer="708" w:gutter="0"/>
       <w:cols w:space="708"/>
@@ -2124,8 +1897,21 @@
     <w:pPr>
       <w:pStyle w:val="Pieddepage"/>
     </w:pPr>
+  </w:p>
+</w:ftr>
+</file>
+
+<file path=word/footer2.xml><?xml version="1.0" encoding="utf-8"?>
+<w:ftr xmlns:wpc="http://schemas.microsoft.com/office/word/2010/wordprocessingCanvas" xmlns:cx="http://schemas.microsoft.com/office/drawing/2014/chartex" xmlns:cx1="http://schemas.microsoft.com/office/drawing/2015/9/8/chartex" xmlns:cx2="http://schemas.microsoft.com/office/drawing/2015/10/21/chartex" xmlns:cx3="http://schemas.microsoft.com/office/drawing/2016/5/9/chartex" xmlns:cx4="http://schemas.microsoft.com/office/drawing/2016/5/10/chartex" xmlns:cx5="http://schemas.microsoft.com/office/drawing/2016/5/11/chartex" xmlns:cx6="http://schemas.microsoft.com/office/drawing/2016/5/12/chartex" xmlns:cx7="http://schemas.microsoft.com/office/drawing/2016/5/13/chartex" xmlns:cx8="http://schemas.microsoft.com/office/drawing/2016/5/14/chartex" xmlns:mc="http://schemas.openxmlformats.org/markup-compatibility/2006" xmlns:aink="http://schemas.microsoft.com/office/drawing/2016/ink" xmlns:am3d="http://schemas.microsoft.com/office/drawing/2017/model3d" xmlns:o="urn:schemas-microsoft-com:office:office" xmlns:oel="http://schemas.microsoft.com/office/2019/extlst" xmlns:r="http://schemas.openxmlformats.org/officeDocument/2006/relationships" xmlns:m="http://schemas.openxmlformats.org/officeDocument/2006/math" xmlns:v="urn:schemas-microsoft-com:vml" xmlns:wp14="http://schemas.microsoft.com/office/word/2010/wordprocessingDrawing" xmlns:wp="http://schemas.openxmlformats.org/drawingml/2006/wordprocessingDrawing" xmlns:w10="urn:schemas-microsoft-com:office:word" xmlns:w="http://schemas.openxmlformats.org/wordprocessingml/2006/main" xmlns:w14="http://schemas.microsoft.com/office/word/2010/wordml" xmlns:w15="http://schemas.microsoft.com/office/word/2012/wordml" xmlns:w16cex="http://schemas.microsoft.com/office/word/2018/wordml/cex" xmlns:w16cid="http://schemas.microsoft.com/office/word/2016/wordml/cid" xmlns:w16="http://schemas.microsoft.com/office/word/2018/wordml" xmlns:w16du="http://schemas.microsoft.com/office/word/2023/wordml/word16du" xmlns:w16sdtdh="http://schemas.microsoft.com/office/word/2020/wordml/sdtdatahash" xmlns:w16sdtfl="http://schemas.microsoft.com/office/word/2024/wordml/sdtformatlock" xmlns:w16se="http://schemas.microsoft.com/office/word/2015/wordml/symex" xmlns:wpg="http://schemas.microsoft.com/office/word/2010/wordprocessingGroup" xmlns:wpi="http://schemas.microsoft.com/office/word/2010/wordprocessingInk" xmlns:wne="http://schemas.microsoft.com/office/word/2006/wordml" xmlns:wps="http://schemas.microsoft.com/office/word/2010/wordprocessingShape" mc:Ignorable="w14 w15 w16se w16cid w16 w16cex w16sdtdh w16sdtfl w16du wp14">
+  <w:p>
+    <w:pPr>
+      <w:pStyle w:val="Pieddepage"/>
+      <w:pBdr>
+        <w:top w:val="single" w:sz="4" w:space="1" w:color="auto"/>
+      </w:pBdr>
+    </w:pPr>
     <w:r>
-      <w:t>Copyright IMX Technologie 2026</w:t>
+      <w:t>IMX Technologie 2026</w:t>
     </w:r>
     <w:r>
       <w:ptab w:relativeTo="margin" w:alignment="center" w:leader="none"/>
@@ -2155,6 +1941,16 @@
 </w:ftr>
 </file>
 
+<file path=word/footer3.xml><?xml version="1.0" encoding="utf-8"?>
+<w:ftr xmlns:wpc="http://schemas.microsoft.com/office/word/2010/wordprocessingCanvas" xmlns:cx="http://schemas.microsoft.com/office/drawing/2014/chartex" xmlns:cx1="http://schemas.microsoft.com/office/drawing/2015/9/8/chartex" xmlns:cx2="http://schemas.microsoft.com/office/drawing/2015/10/21/chartex" xmlns:cx3="http://schemas.microsoft.com/office/drawing/2016/5/9/chartex" xmlns:cx4="http://schemas.microsoft.com/office/drawing/2016/5/10/chartex" xmlns:cx5="http://schemas.microsoft.com/office/drawing/2016/5/11/chartex" xmlns:cx6="http://schemas.microsoft.com/office/drawing/2016/5/12/chartex" xmlns:cx7="http://schemas.microsoft.com/office/drawing/2016/5/13/chartex" xmlns:cx8="http://schemas.microsoft.com/office/drawing/2016/5/14/chartex" xmlns:mc="http://schemas.openxmlformats.org/markup-compatibility/2006" xmlns:aink="http://schemas.microsoft.com/office/drawing/2016/ink" xmlns:am3d="http://schemas.microsoft.com/office/drawing/2017/model3d" xmlns:o="urn:schemas-microsoft-com:office:office" xmlns:oel="http://schemas.microsoft.com/office/2019/extlst" xmlns:r="http://schemas.openxmlformats.org/officeDocument/2006/relationships" xmlns:m="http://schemas.openxmlformats.org/officeDocument/2006/math" xmlns:v="urn:schemas-microsoft-com:vml" xmlns:wp14="http://schemas.microsoft.com/office/word/2010/wordprocessingDrawing" xmlns:wp="http://schemas.openxmlformats.org/drawingml/2006/wordprocessingDrawing" xmlns:w10="urn:schemas-microsoft-com:office:word" xmlns:w="http://schemas.openxmlformats.org/wordprocessingml/2006/main" xmlns:w14="http://schemas.microsoft.com/office/word/2010/wordml" xmlns:w15="http://schemas.microsoft.com/office/word/2012/wordml" xmlns:w16cex="http://schemas.microsoft.com/office/word/2018/wordml/cex" xmlns:w16cid="http://schemas.microsoft.com/office/word/2016/wordml/cid" xmlns:w16="http://schemas.microsoft.com/office/word/2018/wordml" xmlns:w16du="http://schemas.microsoft.com/office/word/2023/wordml/word16du" xmlns:w16sdtdh="http://schemas.microsoft.com/office/word/2020/wordml/sdtdatahash" xmlns:w16sdtfl="http://schemas.microsoft.com/office/word/2024/wordml/sdtformatlock" xmlns:w16se="http://schemas.microsoft.com/office/word/2015/wordml/symex" xmlns:wpg="http://schemas.microsoft.com/office/word/2010/wordprocessingGroup" xmlns:wpi="http://schemas.microsoft.com/office/word/2010/wordprocessingInk" xmlns:wne="http://schemas.microsoft.com/office/word/2006/wordml" xmlns:wps="http://schemas.microsoft.com/office/word/2010/wordprocessingShape" mc:Ignorable="w14 w15 w16se w16cid w16 w16cex w16sdtdh w16sdtfl w16du wp14">
+  <w:p>
+    <w:pPr>
+      <w:pStyle w:val="Pieddepage"/>
+    </w:pPr>
+  </w:p>
+</w:ftr>
+</file>
+
 <file path=word/footnotes.xml><?xml version="1.0" encoding="utf-8"?>
 <w:footnotes xmlns:wpc="http://schemas.microsoft.com/office/word/2010/wordprocessingCanvas" xmlns:cx="http://schemas.microsoft.com/office/drawing/2014/chartex" xmlns:cx1="http://schemas.microsoft.com/office/drawing/2015/9/8/chartex" xmlns:cx2="http://schemas.microsoft.com/office/drawing/2015/10/21/chartex" xmlns:cx3="http://schemas.microsoft.com/office/drawing/2016/5/9/chartex" xmlns:cx4="http://schemas.microsoft.com/office/drawing/2016/5/10/chartex" xmlns:cx5="http://schemas.microsoft.com/office/drawing/2016/5/11/chartex" xmlns:cx6="http://schemas.microsoft.com/office/drawing/2016/5/12/chartex" xmlns:cx7="http://schemas.microsoft.com/office/drawing/2016/5/13/chartex" xmlns:cx8="http://schemas.microsoft.com/office/drawing/2016/5/14/chartex" xmlns:mc="http://schemas.openxmlformats.org/markup-compatibility/2006" xmlns:aink="http://schemas.microsoft.com/office/drawing/2016/ink" xmlns:am3d="http://schemas.microsoft.com/office/drawing/2017/model3d" xmlns:o="urn:schemas-microsoft-com:office:office" xmlns:oel="http://schemas.microsoft.com/office/2019/extlst" xmlns:r="http://schemas.openxmlformats.org/officeDocument/2006/relationships" xmlns:m="http://schemas.openxmlformats.org/officeDocument/2006/math" xmlns:v="urn:schemas-microsoft-com:vml" xmlns:wp14="http://schemas.microsoft.com/office/word/2010/wordprocessingDrawing" xmlns:wp="http://schemas.openxmlformats.org/drawingml/2006/wordprocessingDrawing" xmlns:w10="urn:schemas-microsoft-com:office:word" xmlns:w="http://schemas.openxmlformats.org/wordprocessingml/2006/main" xmlns:w14="http://schemas.microsoft.com/office/word/2010/wordml" xmlns:w15="http://schemas.microsoft.com/office/word/2012/wordml" xmlns:w16cex="http://schemas.microsoft.com/office/word/2018/wordml/cex" xmlns:w16cid="http://schemas.microsoft.com/office/word/2016/wordml/cid" xmlns:w16="http://schemas.microsoft.com/office/word/2018/wordml" xmlns:w16du="http://schemas.microsoft.com/office/word/2023/wordml/word16du" xmlns:w16sdtdh="http://schemas.microsoft.com/office/word/2020/wordml/sdtdatahash" xmlns:w16sdtfl="http://schemas.microsoft.com/office/word/2024/wordml/sdtformatlock" xmlns:w16se="http://schemas.microsoft.com/office/word/2015/wordml/symex" xmlns:wpg="http://schemas.microsoft.com/office/word/2010/wordprocessingGroup" xmlns:wpi="http://schemas.microsoft.com/office/word/2010/wordprocessingInk" xmlns:wne="http://schemas.microsoft.com/office/word/2006/wordml" xmlns:wps="http://schemas.microsoft.com/office/word/2010/wordprocessingShape" mc:Ignorable="w14 w15 w16se w16cid w16 w16cex w16sdtdh w16sdtfl w16du wp14">
   <w:footnote w:type="separator" w:id="-1">
@@ -2172,6 +1968,82 @@
     </w:p>
   </w:footnote>
 </w:footnotes>
+</file>
+
+<file path=word/header1.xml><?xml version="1.0" encoding="utf-8"?>
+<w:hdr xmlns:wpc="http://schemas.microsoft.com/office/word/2010/wordprocessingCanvas" xmlns:cx="http://schemas.microsoft.com/office/drawing/2014/chartex" xmlns:cx1="http://schemas.microsoft.com/office/drawing/2015/9/8/chartex" xmlns:cx2="http://schemas.microsoft.com/office/drawing/2015/10/21/chartex" xmlns:cx3="http://schemas.microsoft.com/office/drawing/2016/5/9/chartex" xmlns:cx4="http://schemas.microsoft.com/office/drawing/2016/5/10/chartex" xmlns:cx5="http://schemas.microsoft.com/office/drawing/2016/5/11/chartex" xmlns:cx6="http://schemas.microsoft.com/office/drawing/2016/5/12/chartex" xmlns:cx7="http://schemas.microsoft.com/office/drawing/2016/5/13/chartex" xmlns:cx8="http://schemas.microsoft.com/office/drawing/2016/5/14/chartex" xmlns:mc="http://schemas.openxmlformats.org/markup-compatibility/2006" xmlns:aink="http://schemas.microsoft.com/office/drawing/2016/ink" xmlns:am3d="http://schemas.microsoft.com/office/drawing/2017/model3d" xmlns:o="urn:schemas-microsoft-com:office:office" xmlns:oel="http://schemas.microsoft.com/office/2019/extlst" xmlns:r="http://schemas.openxmlformats.org/officeDocument/2006/relationships" xmlns:m="http://schemas.openxmlformats.org/officeDocument/2006/math" xmlns:v="urn:schemas-microsoft-com:vml" xmlns:wp14="http://schemas.microsoft.com/office/word/2010/wordprocessingDrawing" xmlns:wp="http://schemas.openxmlformats.org/drawingml/2006/wordprocessingDrawing" xmlns:w10="urn:schemas-microsoft-com:office:word" xmlns:w="http://schemas.openxmlformats.org/wordprocessingml/2006/main" xmlns:w14="http://schemas.microsoft.com/office/word/2010/wordml" xmlns:w15="http://schemas.microsoft.com/office/word/2012/wordml" xmlns:w16cex="http://schemas.microsoft.com/office/word/2018/wordml/cex" xmlns:w16cid="http://schemas.microsoft.com/office/word/2016/wordml/cid" xmlns:w16="http://schemas.microsoft.com/office/word/2018/wordml" xmlns:w16du="http://schemas.microsoft.com/office/word/2023/wordml/word16du" xmlns:w16sdtdh="http://schemas.microsoft.com/office/word/2020/wordml/sdtdatahash" xmlns:w16sdtfl="http://schemas.microsoft.com/office/word/2024/wordml/sdtformatlock" xmlns:w16se="http://schemas.microsoft.com/office/word/2015/wordml/symex" xmlns:wpg="http://schemas.microsoft.com/office/word/2010/wordprocessingGroup" xmlns:wpi="http://schemas.microsoft.com/office/word/2010/wordprocessingInk" xmlns:wne="http://schemas.microsoft.com/office/word/2006/wordml" xmlns:wps="http://schemas.microsoft.com/office/word/2010/wordprocessingShape" mc:Ignorable="w14 w15 w16se w16cid w16 w16cex w16sdtdh w16sdtfl w16du wp14">
+  <w:p>
+    <w:pPr>
+      <w:pStyle w:val="En-tte"/>
+    </w:pPr>
+  </w:p>
+</w:hdr>
+</file>
+
+<file path=word/header2.xml><?xml version="1.0" encoding="utf-8"?>
+<w:hdr xmlns:wpc="http://schemas.microsoft.com/office/word/2010/wordprocessingCanvas" xmlns:cx="http://schemas.microsoft.com/office/drawing/2014/chartex" xmlns:cx1="http://schemas.microsoft.com/office/drawing/2015/9/8/chartex" xmlns:cx2="http://schemas.microsoft.com/office/drawing/2015/10/21/chartex" xmlns:cx3="http://schemas.microsoft.com/office/drawing/2016/5/9/chartex" xmlns:cx4="http://schemas.microsoft.com/office/drawing/2016/5/10/chartex" xmlns:cx5="http://schemas.microsoft.com/office/drawing/2016/5/11/chartex" xmlns:cx6="http://schemas.microsoft.com/office/drawing/2016/5/12/chartex" xmlns:cx7="http://schemas.microsoft.com/office/drawing/2016/5/13/chartex" xmlns:cx8="http://schemas.microsoft.com/office/drawing/2016/5/14/chartex" xmlns:mc="http://schemas.openxmlformats.org/markup-compatibility/2006" xmlns:aink="http://schemas.microsoft.com/office/drawing/2016/ink" xmlns:am3d="http://schemas.microsoft.com/office/drawing/2017/model3d" xmlns:o="urn:schemas-microsoft-com:office:office" xmlns:oel="http://schemas.microsoft.com/office/2019/extlst" xmlns:r="http://schemas.openxmlformats.org/officeDocument/2006/relationships" xmlns:m="http://schemas.openxmlformats.org/officeDocument/2006/math" xmlns:v="urn:schemas-microsoft-com:vml" xmlns:wp14="http://schemas.microsoft.com/office/word/2010/wordprocessingDrawing" xmlns:wp="http://schemas.openxmlformats.org/drawingml/2006/wordprocessingDrawing" xmlns:w10="urn:schemas-microsoft-com:office:word" xmlns:w="http://schemas.openxmlformats.org/wordprocessingml/2006/main" xmlns:w14="http://schemas.microsoft.com/office/word/2010/wordml" xmlns:w15="http://schemas.microsoft.com/office/word/2012/wordml" xmlns:w16cex="http://schemas.microsoft.com/office/word/2018/wordml/cex" xmlns:w16cid="http://schemas.microsoft.com/office/word/2016/wordml/cid" xmlns:w16="http://schemas.microsoft.com/office/word/2018/wordml" xmlns:w16du="http://schemas.microsoft.com/office/word/2023/wordml/word16du" xmlns:w16sdtdh="http://schemas.microsoft.com/office/word/2020/wordml/sdtdatahash" xmlns:w16sdtfl="http://schemas.microsoft.com/office/word/2024/wordml/sdtformatlock" xmlns:w16se="http://schemas.microsoft.com/office/word/2015/wordml/symex" xmlns:wpg="http://schemas.microsoft.com/office/word/2010/wordprocessingGroup" xmlns:wpi="http://schemas.microsoft.com/office/word/2010/wordprocessingInk" xmlns:wne="http://schemas.microsoft.com/office/word/2006/wordml" xmlns:wps="http://schemas.microsoft.com/office/word/2010/wordprocessingShape" mc:Ignorable="w14 w15 w16se w16cid w16 w16cex w16sdtdh w16sdtfl w16du wp14">
+  <w:p>
+    <w:pPr>
+      <w:pStyle w:val="En-tte"/>
+    </w:pPr>
+    <w:r>
+      <w:rPr>
+        <w:noProof/>
+      </w:rPr>
+      <w:drawing>
+        <wp:inline distT="0" distB="0" distL="0" distR="0" wp14:anchorId="6CBA0F97" wp14:editId="38F4FCA5">
+          <wp:extent cx="723569" cy="723569"/>
+          <wp:effectExtent l="0" t="0" r="0" b="0"/>
+          <wp:docPr id="2135637785" name="Image 1"/>
+          <wp:cNvGraphicFramePr>
+            <a:graphicFrameLocks xmlns:a="http://schemas.openxmlformats.org/drawingml/2006/main" noChangeAspect="1"/>
+          </wp:cNvGraphicFramePr>
+          <a:graphic xmlns:a="http://schemas.openxmlformats.org/drawingml/2006/main">
+            <a:graphicData uri="http://schemas.openxmlformats.org/drawingml/2006/picture">
+              <pic:pic xmlns:pic="http://schemas.openxmlformats.org/drawingml/2006/picture">
+                <pic:nvPicPr>
+                  <pic:cNvPr id="2135637785" name="Image 2135637785"/>
+                  <pic:cNvPicPr/>
+                </pic:nvPicPr>
+                <pic:blipFill>
+                  <a:blip r:embed="rId1">
+                    <a:extLst>
+                      <a:ext uri="{28A0092B-C50C-407E-A947-70E740481C1C}">
+                        <a14:useLocalDpi xmlns:a14="http://schemas.microsoft.com/office/drawing/2010/main" val="0"/>
+                      </a:ext>
+                    </a:extLst>
+                  </a:blip>
+                  <a:stretch>
+                    <a:fillRect/>
+                  </a:stretch>
+                </pic:blipFill>
+                <pic:spPr>
+                  <a:xfrm>
+                    <a:off x="0" y="0"/>
+                    <a:ext cx="729093" cy="729093"/>
+                  </a:xfrm>
+                  <a:prstGeom prst="rect">
+                    <a:avLst/>
+                  </a:prstGeom>
+                </pic:spPr>
+              </pic:pic>
+            </a:graphicData>
+          </a:graphic>
+        </wp:inline>
+      </w:drawing>
+    </w:r>
+  </w:p>
+</w:hdr>
+</file>
+
+<file path=word/header3.xml><?xml version="1.0" encoding="utf-8"?>
+<w:hdr xmlns:wpc="http://schemas.microsoft.com/office/word/2010/wordprocessingCanvas" xmlns:cx="http://schemas.microsoft.com/office/drawing/2014/chartex" xmlns:cx1="http://schemas.microsoft.com/office/drawing/2015/9/8/chartex" xmlns:cx2="http://schemas.microsoft.com/office/drawing/2015/10/21/chartex" xmlns:cx3="http://schemas.microsoft.com/office/drawing/2016/5/9/chartex" xmlns:cx4="http://schemas.microsoft.com/office/drawing/2016/5/10/chartex" xmlns:cx5="http://schemas.microsoft.com/office/drawing/2016/5/11/chartex" xmlns:cx6="http://schemas.microsoft.com/office/drawing/2016/5/12/chartex" xmlns:cx7="http://schemas.microsoft.com/office/drawing/2016/5/13/chartex" xmlns:cx8="http://schemas.microsoft.com/office/drawing/2016/5/14/chartex" xmlns:mc="http://schemas.openxmlformats.org/markup-compatibility/2006" xmlns:aink="http://schemas.microsoft.com/office/drawing/2016/ink" xmlns:am3d="http://schemas.microsoft.com/office/drawing/2017/model3d" xmlns:o="urn:schemas-microsoft-com:office:office" xmlns:oel="http://schemas.microsoft.com/office/2019/extlst" xmlns:r="http://schemas.openxmlformats.org/officeDocument/2006/relationships" xmlns:m="http://schemas.openxmlformats.org/officeDocument/2006/math" xmlns:v="urn:schemas-microsoft-com:vml" xmlns:wp14="http://schemas.microsoft.com/office/word/2010/wordprocessingDrawing" xmlns:wp="http://schemas.openxmlformats.org/drawingml/2006/wordprocessingDrawing" xmlns:w10="urn:schemas-microsoft-com:office:word" xmlns:w="http://schemas.openxmlformats.org/wordprocessingml/2006/main" xmlns:w14="http://schemas.microsoft.com/office/word/2010/wordml" xmlns:w15="http://schemas.microsoft.com/office/word/2012/wordml" xmlns:w16cex="http://schemas.microsoft.com/office/word/2018/wordml/cex" xmlns:w16cid="http://schemas.microsoft.com/office/word/2016/wordml/cid" xmlns:w16="http://schemas.microsoft.com/office/word/2018/wordml" xmlns:w16du="http://schemas.microsoft.com/office/word/2023/wordml/word16du" xmlns:w16sdtdh="http://schemas.microsoft.com/office/word/2020/wordml/sdtdatahash" xmlns:w16sdtfl="http://schemas.microsoft.com/office/word/2024/wordml/sdtformatlock" xmlns:w16se="http://schemas.microsoft.com/office/word/2015/wordml/symex" xmlns:wpg="http://schemas.microsoft.com/office/word/2010/wordprocessingGroup" xmlns:wpi="http://schemas.microsoft.com/office/word/2010/wordprocessingInk" xmlns:wne="http://schemas.microsoft.com/office/word/2006/wordml" xmlns:wps="http://schemas.microsoft.com/office/word/2010/wordprocessingShape" mc:Ignorable="w14 w15 w16se w16cid w16 w16cex w16sdtdh w16sdtfl w16du wp14">
+  <w:p>
+    <w:pPr>
+      <w:pStyle w:val="En-tte"/>
+    </w:pPr>
+  </w:p>
+</w:hdr>
 </file>
 
 <file path=word/numbering.xml><?xml version="1.0" encoding="utf-8"?>
@@ -4693,7 +4565,6 @@
   <w:style w:type="character" w:default="1" w:styleId="Policepardfaut">
     <w:name w:val="Default Paragraph Font"/>
     <w:uiPriority w:val="1"/>
-    <w:semiHidden/>
     <w:unhideWhenUsed/>
   </w:style>
   <w:style w:type="table" w:default="1" w:styleId="TableauNormal">

</xml_diff>